<commit_message>
Complete user registration module with frontend, backend, validation and MongoDB integration
</commit_message>
<xml_diff>
--- a/docs/foodhub_Roadmap.docx
+++ b/docs/foodhub_Roadmap.docx
@@ -321,7 +321,7 @@
     <w:p>
       <w:r>
         <w:pict w14:anchorId="4D488632">
-          <v:rect id="_x0000_i1055" style="width:0;height:1.5pt" o:hralign="center" o:hrstd="t" o:hr="t" fillcolor="#a0a0a0" stroked="f"/>
+          <v:rect id="_x0000_i1025" style="width:0;height:1.5pt" o:hralign="center" o:hrstd="t" o:hr="t" fillcolor="#a0a0a0" stroked="f"/>
         </w:pict>
       </w:r>
     </w:p>
@@ -491,7 +491,7 @@
     <w:p>
       <w:r>
         <w:pict w14:anchorId="7250FA76">
-          <v:rect id="_x0000_i1056" style="width:0;height:1.5pt" o:hralign="center" o:hrstd="t" o:hr="t" fillcolor="#a0a0a0" stroked="f"/>
+          <v:rect id="_x0000_i1026" style="width:0;height:1.5pt" o:hralign="center" o:hrstd="t" o:hr="t" fillcolor="#a0a0a0" stroked="f"/>
         </w:pict>
       </w:r>
     </w:p>
@@ -667,7 +667,7 @@
     <w:p>
       <w:r>
         <w:pict w14:anchorId="27A579F4">
-          <v:rect id="_x0000_i1057" style="width:0;height:1.5pt" o:hralign="center" o:hrstd="t" o:hr="t" fillcolor="#a0a0a0" stroked="f"/>
+          <v:rect id="_x0000_i1027" style="width:0;height:1.5pt" o:hralign="center" o:hrstd="t" o:hr="t" fillcolor="#a0a0a0" stroked="f"/>
         </w:pict>
       </w:r>
     </w:p>
@@ -780,7 +780,7 @@
     <w:p>
       <w:r>
         <w:pict w14:anchorId="12444D80">
-          <v:rect id="_x0000_i1058" style="width:0;height:1.5pt" o:hralign="center" o:hrstd="t" o:hr="t" fillcolor="#a0a0a0" stroked="f"/>
+          <v:rect id="_x0000_i1028" style="width:0;height:1.5pt" o:hralign="center" o:hrstd="t" o:hr="t" fillcolor="#a0a0a0" stroked="f"/>
         </w:pict>
       </w:r>
     </w:p>
@@ -869,7 +869,7 @@
     <w:p>
       <w:r>
         <w:pict w14:anchorId="615DE264">
-          <v:rect id="_x0000_i1059" style="width:0;height:1.5pt" o:hralign="center" o:hrstd="t" o:hr="t" fillcolor="#a0a0a0" stroked="f"/>
+          <v:rect id="_x0000_i1029" style="width:0;height:1.5pt" o:hralign="center" o:hrstd="t" o:hr="t" fillcolor="#a0a0a0" stroked="f"/>
         </w:pict>
       </w:r>
     </w:p>
@@ -1276,7 +1276,7 @@
     <w:p>
       <w:r>
         <w:pict w14:anchorId="08A06739">
-          <v:rect id="_x0000_i1125" style="width:0;height:1.5pt" o:hralign="center" o:hrstd="t" o:hr="t" fillcolor="#a0a0a0" stroked="f"/>
+          <v:rect id="_x0000_i1030" style="width:0;height:1.5pt" o:hralign="center" o:hrstd="t" o:hr="t" fillcolor="#a0a0a0" stroked="f"/>
         </w:pict>
       </w:r>
     </w:p>
@@ -1467,7 +1467,7 @@
     <w:p>
       <w:r>
         <w:pict w14:anchorId="0CA4AB49">
-          <v:rect id="_x0000_i1126" style="width:0;height:1.5pt" o:hralign="center" o:hrstd="t" o:hr="t" fillcolor="#a0a0a0" stroked="f"/>
+          <v:rect id="_x0000_i1031" style="width:0;height:1.5pt" o:hralign="center" o:hrstd="t" o:hr="t" fillcolor="#a0a0a0" stroked="f"/>
         </w:pict>
       </w:r>
     </w:p>
@@ -1594,7 +1594,7 @@
     <w:p>
       <w:r>
         <w:pict w14:anchorId="244BBE20">
-          <v:rect id="_x0000_i1127" style="width:0;height:1.5pt" o:hralign="center" o:hrstd="t" o:hr="t" fillcolor="#a0a0a0" stroked="f"/>
+          <v:rect id="_x0000_i1032" style="width:0;height:1.5pt" o:hralign="center" o:hrstd="t" o:hr="t" fillcolor="#a0a0a0" stroked="f"/>
         </w:pict>
       </w:r>
     </w:p>
@@ -1710,7 +1710,7 @@
     <w:p>
       <w:r>
         <w:pict w14:anchorId="08C9AAB8">
-          <v:rect id="_x0000_i1128" style="width:0;height:1.5pt" o:hralign="center" o:hrstd="t" o:hr="t" fillcolor="#a0a0a0" stroked="f"/>
+          <v:rect id="_x0000_i1033" style="width:0;height:1.5pt" o:hralign="center" o:hrstd="t" o:hr="t" fillcolor="#a0a0a0" stroked="f"/>
         </w:pict>
       </w:r>
     </w:p>
@@ -1842,7 +1842,7 @@
     <w:p>
       <w:r>
         <w:pict w14:anchorId="3BA70732">
-          <v:rect id="_x0000_i1129" style="width:0;height:1.5pt" o:hralign="center" o:hrstd="t" o:hr="t" fillcolor="#a0a0a0" stroked="f"/>
+          <v:rect id="_x0000_i1034" style="width:0;height:1.5pt" o:hralign="center" o:hrstd="t" o:hr="t" fillcolor="#a0a0a0" stroked="f"/>
         </w:pict>
       </w:r>
     </w:p>
@@ -2034,7 +2034,7 @@
     <w:p>
       <w:r>
         <w:pict w14:anchorId="11CBE567">
-          <v:rect id="_x0000_i1130" style="width:0;height:1.5pt" o:hralign="center" o:hrstd="t" o:hr="t" fillcolor="#a0a0a0" stroked="f"/>
+          <v:rect id="_x0000_i1035" style="width:0;height:1.5pt" o:hralign="center" o:hrstd="t" o:hr="t" fillcolor="#a0a0a0" stroked="f"/>
         </w:pict>
       </w:r>
     </w:p>
@@ -2120,7 +2120,7 @@
     <w:p>
       <w:r>
         <w:pict w14:anchorId="562C6AE5">
-          <v:rect id="_x0000_i1131" style="width:0;height:1.5pt" o:hralign="center" o:hrstd="t" o:hr="t" fillcolor="#a0a0a0" stroked="f"/>
+          <v:rect id="_x0000_i1036" style="width:0;height:1.5pt" o:hralign="center" o:hrstd="t" o:hr="t" fillcolor="#a0a0a0" stroked="f"/>
         </w:pict>
       </w:r>
     </w:p>
@@ -2243,7 +2243,7 @@
     <w:p>
       <w:r>
         <w:pict w14:anchorId="010DC22A">
-          <v:rect id="_x0000_i1132" style="width:0;height:1.5pt" o:hralign="center" o:hrstd="t" o:hr="t" fillcolor="#a0a0a0" stroked="f"/>
+          <v:rect id="_x0000_i1037" style="width:0;height:1.5pt" o:hralign="center" o:hrstd="t" o:hr="t" fillcolor="#a0a0a0" stroked="f"/>
         </w:pict>
       </w:r>
     </w:p>
@@ -2406,7 +2406,7 @@
     <w:p>
       <w:r>
         <w:pict w14:anchorId="07DE791D">
-          <v:rect id="_x0000_i1133" style="width:0;height:1.5pt" o:hralign="center" o:hrstd="t" o:hr="t" fillcolor="#a0a0a0" stroked="f"/>
+          <v:rect id="_x0000_i1038" style="width:0;height:1.5pt" o:hralign="center" o:hrstd="t" o:hr="t" fillcolor="#a0a0a0" stroked="f"/>
         </w:pict>
       </w:r>
     </w:p>
@@ -2491,7 +2491,7 @@
     <w:p>
       <w:r>
         <w:pict w14:anchorId="7CD8F552">
-          <v:rect id="_x0000_i1134" style="width:0;height:1.5pt" o:hralign="center" o:hrstd="t" o:hr="t" fillcolor="#a0a0a0" stroked="f"/>
+          <v:rect id="_x0000_i1039" style="width:0;height:1.5pt" o:hralign="center" o:hrstd="t" o:hr="t" fillcolor="#a0a0a0" stroked="f"/>
         </w:pict>
       </w:r>
     </w:p>
@@ -2576,6 +2576,1666 @@
       </w:pPr>
       <w:r>
         <w:t>Docker</w:t>
+      </w:r>
+    </w:p>
+    <w:p/>
+    <w:p/>
+    <w:p/>
+    <w:p/>
+    <w:p/>
+    <w:p/>
+    <w:p/>
+    <w:p/>
+    <w:p>
+      <w:pPr>
+        <w:rPr>
+          <w:b/>
+          <w:bCs/>
+        </w:rPr>
+      </w:pPr>
+      <w:proofErr w:type="spellStart"/>
+      <w:r>
+        <w:rPr>
+          <w:b/>
+          <w:bCs/>
+        </w:rPr>
+        <w:lastRenderedPageBreak/>
+        <w:t>FoodHub</w:t>
+      </w:r>
+      <w:proofErr w:type="spellEnd"/>
+      <w:r>
+        <w:rPr>
+          <w:b/>
+          <w:bCs/>
+        </w:rPr>
+        <w:t xml:space="preserve"> Complete Roadmap (v2)</w:t>
+      </w:r>
+    </w:p>
+    <w:p>
+      <w:pPr>
+        <w:rPr>
+          <w:b/>
+          <w:bCs/>
+        </w:rPr>
+      </w:pPr>
+      <w:r>
+        <w:rPr>
+          <w:b/>
+          <w:bCs/>
+        </w:rPr>
+        <w:t xml:space="preserve">Phase 1 – Foundation </w:t>
+      </w:r>
+      <w:r>
+        <w:rPr>
+          <w:rFonts w:ascii="Segoe UI Emoji" w:hAnsi="Segoe UI Emoji" w:cs="Segoe UI Emoji"/>
+          <w:b/>
+          <w:bCs/>
+        </w:rPr>
+        <w:t>✅</w:t>
+      </w:r>
+      <w:r>
+        <w:rPr>
+          <w:b/>
+          <w:bCs/>
+        </w:rPr>
+        <w:t xml:space="preserve"> (Completed)</w:t>
+      </w:r>
+    </w:p>
+    <w:p>
+      <w:r>
+        <w:rPr>
+          <w:rFonts w:ascii="Segoe UI Emoji" w:hAnsi="Segoe UI Emoji" w:cs="Segoe UI Emoji"/>
+        </w:rPr>
+        <w:t>✅</w:t>
+      </w:r>
+      <w:r>
+        <w:t xml:space="preserve"> React Fundamentals</w:t>
+      </w:r>
+    </w:p>
+    <w:p>
+      <w:r>
+        <w:rPr>
+          <w:rFonts w:ascii="Segoe UI Emoji" w:hAnsi="Segoe UI Emoji" w:cs="Segoe UI Emoji"/>
+        </w:rPr>
+        <w:t>✅</w:t>
+      </w:r>
+      <w:r>
+        <w:t xml:space="preserve"> Components</w:t>
+      </w:r>
+    </w:p>
+    <w:p>
+      <w:r>
+        <w:rPr>
+          <w:rFonts w:ascii="Segoe UI Emoji" w:hAnsi="Segoe UI Emoji" w:cs="Segoe UI Emoji"/>
+        </w:rPr>
+        <w:t>✅</w:t>
+      </w:r>
+      <w:r>
+        <w:t xml:space="preserve"> Props</w:t>
+      </w:r>
+    </w:p>
+    <w:p>
+      <w:r>
+        <w:rPr>
+          <w:rFonts w:ascii="Segoe UI Emoji" w:hAnsi="Segoe UI Emoji" w:cs="Segoe UI Emoji"/>
+        </w:rPr>
+        <w:t>✅</w:t>
+      </w:r>
+      <w:r>
+        <w:t xml:space="preserve"> React Router</w:t>
+      </w:r>
+    </w:p>
+    <w:p>
+      <w:r>
+        <w:rPr>
+          <w:rFonts w:ascii="Segoe UI Emoji" w:hAnsi="Segoe UI Emoji" w:cs="Segoe UI Emoji"/>
+        </w:rPr>
+        <w:t>✅</w:t>
+      </w:r>
+      <w:r>
+        <w:t xml:space="preserve"> Express.js</w:t>
+      </w:r>
+    </w:p>
+    <w:p>
+      <w:r>
+        <w:rPr>
+          <w:rFonts w:ascii="Segoe UI Emoji" w:hAnsi="Segoe UI Emoji" w:cs="Segoe UI Emoji"/>
+        </w:rPr>
+        <w:t>✅</w:t>
+      </w:r>
+      <w:r>
+        <w:t xml:space="preserve"> MongoDB Atlas</w:t>
+      </w:r>
+    </w:p>
+    <w:p>
+      <w:r>
+        <w:rPr>
+          <w:rFonts w:ascii="Segoe UI Emoji" w:hAnsi="Segoe UI Emoji" w:cs="Segoe UI Emoji"/>
+        </w:rPr>
+        <w:t>✅</w:t>
+      </w:r>
+      <w:r>
+        <w:t xml:space="preserve"> Mongoose</w:t>
+      </w:r>
+    </w:p>
+    <w:p>
+      <w:r>
+        <w:rPr>
+          <w:rFonts w:ascii="Segoe UI Emoji" w:hAnsi="Segoe UI Emoji" w:cs="Segoe UI Emoji"/>
+        </w:rPr>
+        <w:t>✅</w:t>
+      </w:r>
+      <w:r>
+        <w:t xml:space="preserve"> CRUD APIs</w:t>
+      </w:r>
+    </w:p>
+    <w:p>
+      <w:r>
+        <w:rPr>
+          <w:rFonts w:ascii="Segoe UI Emoji" w:hAnsi="Segoe UI Emoji" w:cs="Segoe UI Emoji"/>
+        </w:rPr>
+        <w:t>✅</w:t>
+      </w:r>
+      <w:r>
+        <w:t xml:space="preserve"> Axios Integration</w:t>
+      </w:r>
+    </w:p>
+    <w:p>
+      <w:r>
+        <w:rPr>
+          <w:rFonts w:ascii="Segoe UI Emoji" w:hAnsi="Segoe UI Emoji" w:cs="Segoe UI Emoji"/>
+        </w:rPr>
+        <w:t>✅</w:t>
+      </w:r>
+      <w:r>
+        <w:t xml:space="preserve"> Food Module (User Side)</w:t>
+      </w:r>
+    </w:p>
+    <w:p>
+      <w:r>
+        <w:pict w14:anchorId="64B86B9F">
+          <v:rect id="_x0000_i1100" style="width:0;height:1.5pt" o:hralign="center" o:hrstd="t" o:hr="t" fillcolor="#a0a0a0" stroked="f"/>
+        </w:pict>
+      </w:r>
+    </w:p>
+    <w:p>
+      <w:pPr>
+        <w:rPr>
+          <w:b/>
+          <w:bCs/>
+        </w:rPr>
+      </w:pPr>
+      <w:r>
+        <w:rPr>
+          <w:b/>
+          <w:bCs/>
+        </w:rPr>
+        <w:t>Phase 2 – Authentication (Current)</w:t>
+      </w:r>
+    </w:p>
+    <w:p>
+      <w:r>
+        <w:rPr>
+          <w:rFonts w:ascii="Segoe UI Emoji" w:hAnsi="Segoe UI Emoji" w:cs="Segoe UI Emoji"/>
+        </w:rPr>
+        <w:t>🔄</w:t>
+      </w:r>
+      <w:r>
+        <w:t xml:space="preserve"> User Authentication</w:t>
+      </w:r>
+    </w:p>
+    <w:p/>
+    <w:p>
+      <w:r>
+        <w:rPr>
+          <w:rFonts w:ascii="MS Gothic" w:eastAsia="MS Gothic" w:hAnsi="MS Gothic" w:cs="MS Gothic" w:hint="eastAsia"/>
+        </w:rPr>
+        <w:t>├</w:t>
+      </w:r>
+      <w:r>
+        <w:rPr>
+          <w:rFonts w:ascii="Calibri" w:hAnsi="Calibri" w:cs="Calibri"/>
+        </w:rPr>
+        <w:t>──</w:t>
+      </w:r>
+      <w:r>
+        <w:t xml:space="preserve"> User Model</w:t>
+      </w:r>
+    </w:p>
+    <w:p>
+      <w:r>
+        <w:rPr>
+          <w:rFonts w:ascii="MS Gothic" w:eastAsia="MS Gothic" w:hAnsi="MS Gothic" w:cs="MS Gothic" w:hint="eastAsia"/>
+        </w:rPr>
+        <w:t>├</w:t>
+      </w:r>
+      <w:r>
+        <w:rPr>
+          <w:rFonts w:ascii="Calibri" w:hAnsi="Calibri" w:cs="Calibri"/>
+        </w:rPr>
+        <w:t>──</w:t>
+      </w:r>
+      <w:r>
+        <w:t xml:space="preserve"> Register (Customer)</w:t>
+      </w:r>
+    </w:p>
+    <w:p>
+      <w:r>
+        <w:rPr>
+          <w:rFonts w:ascii="MS Gothic" w:eastAsia="MS Gothic" w:hAnsi="MS Gothic" w:cs="MS Gothic" w:hint="eastAsia"/>
+        </w:rPr>
+        <w:t>├</w:t>
+      </w:r>
+      <w:r>
+        <w:rPr>
+          <w:rFonts w:ascii="Calibri" w:hAnsi="Calibri" w:cs="Calibri"/>
+        </w:rPr>
+        <w:t>──</w:t>
+      </w:r>
+      <w:r>
+        <w:t xml:space="preserve"> Login (All Roles)</w:t>
+      </w:r>
+    </w:p>
+    <w:p>
+      <w:r>
+        <w:rPr>
+          <w:rFonts w:ascii="MS Gothic" w:eastAsia="MS Gothic" w:hAnsi="MS Gothic" w:cs="MS Gothic" w:hint="eastAsia"/>
+        </w:rPr>
+        <w:t>├</w:t>
+      </w:r>
+      <w:r>
+        <w:rPr>
+          <w:rFonts w:ascii="Calibri" w:hAnsi="Calibri" w:cs="Calibri"/>
+        </w:rPr>
+        <w:t>──</w:t>
+      </w:r>
+      <w:r>
+        <w:t xml:space="preserve"> Password Hashing (</w:t>
+      </w:r>
+      <w:proofErr w:type="spellStart"/>
+      <w:r>
+        <w:t>bcrypt</w:t>
+      </w:r>
+      <w:proofErr w:type="spellEnd"/>
+      <w:r>
+        <w:t>)</w:t>
+      </w:r>
+    </w:p>
+    <w:p>
+      <w:r>
+        <w:rPr>
+          <w:rFonts w:ascii="MS Gothic" w:eastAsia="MS Gothic" w:hAnsi="MS Gothic" w:cs="MS Gothic" w:hint="eastAsia"/>
+        </w:rPr>
+        <w:t>├</w:t>
+      </w:r>
+      <w:r>
+        <w:rPr>
+          <w:rFonts w:ascii="Calibri" w:hAnsi="Calibri" w:cs="Calibri"/>
+        </w:rPr>
+        <w:t>──</w:t>
+      </w:r>
+      <w:r>
+        <w:t xml:space="preserve"> JWT Authentication</w:t>
+      </w:r>
+    </w:p>
+    <w:p>
+      <w:r>
+        <w:rPr>
+          <w:rFonts w:ascii="MS Gothic" w:eastAsia="MS Gothic" w:hAnsi="MS Gothic" w:cs="MS Gothic" w:hint="eastAsia"/>
+        </w:rPr>
+        <w:t>├</w:t>
+      </w:r>
+      <w:r>
+        <w:rPr>
+          <w:rFonts w:ascii="Calibri" w:hAnsi="Calibri" w:cs="Calibri"/>
+        </w:rPr>
+        <w:t>──</w:t>
+      </w:r>
+      <w:r>
+        <w:t xml:space="preserve"> Protected Routes</w:t>
+      </w:r>
+    </w:p>
+    <w:p>
+      <w:r>
+        <w:rPr>
+          <w:rFonts w:ascii="MS Gothic" w:eastAsia="MS Gothic" w:hAnsi="MS Gothic" w:cs="MS Gothic" w:hint="eastAsia"/>
+        </w:rPr>
+        <w:t>├</w:t>
+      </w:r>
+      <w:r>
+        <w:rPr>
+          <w:rFonts w:ascii="Calibri" w:hAnsi="Calibri" w:cs="Calibri"/>
+        </w:rPr>
+        <w:t>──</w:t>
+      </w:r>
+      <w:r>
+        <w:t xml:space="preserve"> Role-Based Authorization</w:t>
+      </w:r>
+    </w:p>
+    <w:p>
+      <w:r>
+        <w:t>└── React Login/Register Integration</w:t>
+      </w:r>
+    </w:p>
+    <w:p>
+      <w:r>
+        <w:t>At this point:</w:t>
+      </w:r>
+    </w:p>
+    <w:p>
+      <w:r>
+        <w:lastRenderedPageBreak/>
+        <w:t xml:space="preserve">Customer </w:t>
+      </w:r>
+      <w:r>
+        <w:rPr>
+          <w:rFonts w:ascii="Segoe UI Emoji" w:hAnsi="Segoe UI Emoji" w:cs="Segoe UI Emoji"/>
+        </w:rPr>
+        <w:t>✅</w:t>
+      </w:r>
+    </w:p>
+    <w:p/>
+    <w:p>
+      <w:r>
+        <w:t xml:space="preserve">Admin (can login if account exists) </w:t>
+      </w:r>
+      <w:r>
+        <w:rPr>
+          <w:rFonts w:ascii="Segoe UI Emoji" w:hAnsi="Segoe UI Emoji" w:cs="Segoe UI Emoji"/>
+        </w:rPr>
+        <w:t>✅</w:t>
+      </w:r>
+    </w:p>
+    <w:p/>
+    <w:p>
+      <w:r>
+        <w:t xml:space="preserve">Delivery Partner (can login if account exists) </w:t>
+      </w:r>
+      <w:r>
+        <w:rPr>
+          <w:rFonts w:ascii="Segoe UI Emoji" w:hAnsi="Segoe UI Emoji" w:cs="Segoe UI Emoji"/>
+        </w:rPr>
+        <w:t>✅</w:t>
+      </w:r>
+    </w:p>
+    <w:p>
+      <w:r>
+        <w:t xml:space="preserve">Notice we </w:t>
+      </w:r>
+      <w:r>
+        <w:rPr>
+          <w:b/>
+          <w:bCs/>
+        </w:rPr>
+        <w:t>don't</w:t>
+      </w:r>
+      <w:r>
+        <w:t xml:space="preserve"> build the delivery workflow yet—we only make sure the authentication system supports all roles.</w:t>
+      </w:r>
+    </w:p>
+    <w:p>
+      <w:r>
+        <w:pict w14:anchorId="1205A9E7">
+          <v:rect id="_x0000_i1101" style="width:0;height:1.5pt" o:hralign="center" o:hrstd="t" o:hr="t" fillcolor="#a0a0a0" stroked="f"/>
+        </w:pict>
+      </w:r>
+    </w:p>
+    <w:p>
+      <w:pPr>
+        <w:rPr>
+          <w:b/>
+          <w:bCs/>
+        </w:rPr>
+      </w:pPr>
+      <w:r>
+        <w:rPr>
+          <w:b/>
+          <w:bCs/>
+        </w:rPr>
+        <w:t>Phase 3 – Customer Module</w:t>
+      </w:r>
+    </w:p>
+    <w:p>
+      <w:r>
+        <w:t>Customer</w:t>
+      </w:r>
+    </w:p>
+    <w:p/>
+    <w:p>
+      <w:r>
+        <w:rPr>
+          <w:rFonts w:ascii="MS Gothic" w:eastAsia="MS Gothic" w:hAnsi="MS Gothic" w:cs="MS Gothic" w:hint="eastAsia"/>
+        </w:rPr>
+        <w:t>├</w:t>
+      </w:r>
+      <w:r>
+        <w:rPr>
+          <w:rFonts w:ascii="Calibri" w:hAnsi="Calibri" w:cs="Calibri"/>
+        </w:rPr>
+        <w:t>──</w:t>
+      </w:r>
+      <w:r>
+        <w:t xml:space="preserve"> View Foods</w:t>
+      </w:r>
+    </w:p>
+    <w:p>
+      <w:r>
+        <w:rPr>
+          <w:rFonts w:ascii="MS Gothic" w:eastAsia="MS Gothic" w:hAnsi="MS Gothic" w:cs="MS Gothic" w:hint="eastAsia"/>
+        </w:rPr>
+        <w:t>├</w:t>
+      </w:r>
+      <w:r>
+        <w:rPr>
+          <w:rFonts w:ascii="Calibri" w:hAnsi="Calibri" w:cs="Calibri"/>
+        </w:rPr>
+        <w:t>──</w:t>
+      </w:r>
+      <w:r>
+        <w:t xml:space="preserve"> Search Foods</w:t>
+      </w:r>
+    </w:p>
+    <w:p>
+      <w:r>
+        <w:rPr>
+          <w:rFonts w:ascii="MS Gothic" w:eastAsia="MS Gothic" w:hAnsi="MS Gothic" w:cs="MS Gothic" w:hint="eastAsia"/>
+        </w:rPr>
+        <w:t>├</w:t>
+      </w:r>
+      <w:r>
+        <w:rPr>
+          <w:rFonts w:ascii="Calibri" w:hAnsi="Calibri" w:cs="Calibri"/>
+        </w:rPr>
+        <w:t>──</w:t>
+      </w:r>
+      <w:r>
+        <w:t xml:space="preserve"> Filter Categories</w:t>
+      </w:r>
+    </w:p>
+    <w:p>
+      <w:r>
+        <w:rPr>
+          <w:rFonts w:ascii="MS Gothic" w:eastAsia="MS Gothic" w:hAnsi="MS Gothic" w:cs="MS Gothic" w:hint="eastAsia"/>
+        </w:rPr>
+        <w:t>├</w:t>
+      </w:r>
+      <w:r>
+        <w:rPr>
+          <w:rFonts w:ascii="Calibri" w:hAnsi="Calibri" w:cs="Calibri"/>
+        </w:rPr>
+        <w:t>──</w:t>
+      </w:r>
+      <w:r>
+        <w:t xml:space="preserve"> Cart</w:t>
+      </w:r>
+    </w:p>
+    <w:p>
+      <w:r>
+        <w:rPr>
+          <w:rFonts w:ascii="MS Gothic" w:eastAsia="MS Gothic" w:hAnsi="MS Gothic" w:cs="MS Gothic" w:hint="eastAsia"/>
+        </w:rPr>
+        <w:t>├</w:t>
+      </w:r>
+      <w:r>
+        <w:rPr>
+          <w:rFonts w:ascii="Calibri" w:hAnsi="Calibri" w:cs="Calibri"/>
+        </w:rPr>
+        <w:t>──</w:t>
+      </w:r>
+      <w:r>
+        <w:t xml:space="preserve"> Wishlist (Optional)</w:t>
+      </w:r>
+    </w:p>
+    <w:p>
+      <w:r>
+        <w:rPr>
+          <w:rFonts w:ascii="MS Gothic" w:eastAsia="MS Gothic" w:hAnsi="MS Gothic" w:cs="MS Gothic" w:hint="eastAsia"/>
+        </w:rPr>
+        <w:t>├</w:t>
+      </w:r>
+      <w:r>
+        <w:rPr>
+          <w:rFonts w:ascii="Calibri" w:hAnsi="Calibri" w:cs="Calibri"/>
+        </w:rPr>
+        <w:t>──</w:t>
+      </w:r>
+      <w:r>
+        <w:t xml:space="preserve"> Checkout</w:t>
+      </w:r>
+    </w:p>
+    <w:p>
+      <w:r>
+        <w:rPr>
+          <w:rFonts w:ascii="MS Gothic" w:eastAsia="MS Gothic" w:hAnsi="MS Gothic" w:cs="MS Gothic" w:hint="eastAsia"/>
+        </w:rPr>
+        <w:t>├</w:t>
+      </w:r>
+      <w:r>
+        <w:rPr>
+          <w:rFonts w:ascii="Calibri" w:hAnsi="Calibri" w:cs="Calibri"/>
+        </w:rPr>
+        <w:t>──</w:t>
+      </w:r>
+      <w:r>
+        <w:t xml:space="preserve"> Place Order</w:t>
+      </w:r>
+    </w:p>
+    <w:p>
+      <w:r>
+        <w:rPr>
+          <w:rFonts w:ascii="MS Gothic" w:eastAsia="MS Gothic" w:hAnsi="MS Gothic" w:cs="MS Gothic" w:hint="eastAsia"/>
+        </w:rPr>
+        <w:t>├</w:t>
+      </w:r>
+      <w:r>
+        <w:rPr>
+          <w:rFonts w:ascii="Calibri" w:hAnsi="Calibri" w:cs="Calibri"/>
+        </w:rPr>
+        <w:t>──</w:t>
+      </w:r>
+      <w:r>
+        <w:t xml:space="preserve"> Order History</w:t>
+      </w:r>
+    </w:p>
+    <w:p>
+      <w:r>
+        <w:rPr>
+          <w:rFonts w:ascii="MS Gothic" w:eastAsia="MS Gothic" w:hAnsi="MS Gothic" w:cs="MS Gothic" w:hint="eastAsia"/>
+        </w:rPr>
+        <w:t>├</w:t>
+      </w:r>
+      <w:r>
+        <w:rPr>
+          <w:rFonts w:ascii="Calibri" w:hAnsi="Calibri" w:cs="Calibri"/>
+        </w:rPr>
+        <w:t>──</w:t>
+      </w:r>
+      <w:r>
+        <w:t xml:space="preserve"> User Profile</w:t>
+      </w:r>
+    </w:p>
+    <w:p>
+      <w:r>
+        <w:t>└── Address Management</w:t>
+      </w:r>
+    </w:p>
+    <w:p>
+      <w:r>
+        <w:pict w14:anchorId="7E53AF0C">
+          <v:rect id="_x0000_i1102" style="width:0;height:1.5pt" o:hralign="center" o:hrstd="t" o:hr="t" fillcolor="#a0a0a0" stroked="f"/>
+        </w:pict>
+      </w:r>
+    </w:p>
+    <w:p>
+      <w:pPr>
+        <w:rPr>
+          <w:b/>
+          <w:bCs/>
+        </w:rPr>
+      </w:pPr>
+      <w:r>
+        <w:rPr>
+          <w:b/>
+          <w:bCs/>
+        </w:rPr>
+        <w:t>Phase 4 – Admin Module</w:t>
+      </w:r>
+    </w:p>
+    <w:p>
+      <w:r>
+        <w:t>Admin Dashboard</w:t>
+      </w:r>
+    </w:p>
+    <w:p/>
+    <w:p>
+      <w:r>
+        <w:rPr>
+          <w:rFonts w:ascii="MS Gothic" w:eastAsia="MS Gothic" w:hAnsi="MS Gothic" w:cs="MS Gothic" w:hint="eastAsia"/>
+        </w:rPr>
+        <w:t>├</w:t>
+      </w:r>
+      <w:r>
+        <w:rPr>
+          <w:rFonts w:ascii="Calibri" w:hAnsi="Calibri" w:cs="Calibri"/>
+        </w:rPr>
+        <w:t>──</w:t>
+      </w:r>
+      <w:r>
+        <w:t xml:space="preserve"> Dashboard Statistics</w:t>
+      </w:r>
+    </w:p>
+    <w:p>
+      <w:r>
+        <w:rPr>
+          <w:rFonts w:ascii="MS Gothic" w:eastAsia="MS Gothic" w:hAnsi="MS Gothic" w:cs="MS Gothic" w:hint="eastAsia"/>
+        </w:rPr>
+        <w:lastRenderedPageBreak/>
+        <w:t>├</w:t>
+      </w:r>
+      <w:r>
+        <w:rPr>
+          <w:rFonts w:ascii="Calibri" w:hAnsi="Calibri" w:cs="Calibri"/>
+        </w:rPr>
+        <w:t>──</w:t>
+      </w:r>
+      <w:r>
+        <w:t xml:space="preserve"> Manage Foods</w:t>
+      </w:r>
+    </w:p>
+    <w:p>
+      <w:r>
+        <w:t xml:space="preserve">│     </w:t>
+      </w:r>
+      <w:r>
+        <w:rPr>
+          <w:rFonts w:ascii="MS Gothic" w:eastAsia="MS Gothic" w:hAnsi="MS Gothic" w:cs="MS Gothic" w:hint="eastAsia"/>
+        </w:rPr>
+        <w:t>├</w:t>
+      </w:r>
+      <w:r>
+        <w:rPr>
+          <w:rFonts w:ascii="Calibri" w:hAnsi="Calibri" w:cs="Calibri"/>
+        </w:rPr>
+        <w:t>──</w:t>
+      </w:r>
+      <w:r>
+        <w:t xml:space="preserve"> Add</w:t>
+      </w:r>
+    </w:p>
+    <w:p>
+      <w:r>
+        <w:t xml:space="preserve">│     </w:t>
+      </w:r>
+      <w:r>
+        <w:rPr>
+          <w:rFonts w:ascii="MS Gothic" w:eastAsia="MS Gothic" w:hAnsi="MS Gothic" w:cs="MS Gothic" w:hint="eastAsia"/>
+        </w:rPr>
+        <w:t>├</w:t>
+      </w:r>
+      <w:r>
+        <w:rPr>
+          <w:rFonts w:ascii="Calibri" w:hAnsi="Calibri" w:cs="Calibri"/>
+        </w:rPr>
+        <w:t>──</w:t>
+      </w:r>
+      <w:r>
+        <w:t xml:space="preserve"> Edit</w:t>
+      </w:r>
+    </w:p>
+    <w:p>
+      <w:r>
+        <w:t>│     └── Delete</w:t>
+      </w:r>
+    </w:p>
+    <w:p>
+      <w:r>
+        <w:t>│</w:t>
+      </w:r>
+    </w:p>
+    <w:p>
+      <w:r>
+        <w:rPr>
+          <w:rFonts w:ascii="MS Gothic" w:eastAsia="MS Gothic" w:hAnsi="MS Gothic" w:cs="MS Gothic" w:hint="eastAsia"/>
+        </w:rPr>
+        <w:t>├</w:t>
+      </w:r>
+      <w:r>
+        <w:rPr>
+          <w:rFonts w:ascii="Calibri" w:hAnsi="Calibri" w:cs="Calibri"/>
+        </w:rPr>
+        <w:t>──</w:t>
+      </w:r>
+      <w:r>
+        <w:t xml:space="preserve"> Manage Categories</w:t>
+      </w:r>
+    </w:p>
+    <w:p>
+      <w:r>
+        <w:t>│</w:t>
+      </w:r>
+    </w:p>
+    <w:p>
+      <w:r>
+        <w:rPr>
+          <w:rFonts w:ascii="MS Gothic" w:eastAsia="MS Gothic" w:hAnsi="MS Gothic" w:cs="MS Gothic" w:hint="eastAsia"/>
+        </w:rPr>
+        <w:t>├</w:t>
+      </w:r>
+      <w:r>
+        <w:rPr>
+          <w:rFonts w:ascii="Calibri" w:hAnsi="Calibri" w:cs="Calibri"/>
+        </w:rPr>
+        <w:t>──</w:t>
+      </w:r>
+      <w:r>
+        <w:t xml:space="preserve"> Manage Users</w:t>
+      </w:r>
+    </w:p>
+    <w:p>
+      <w:r>
+        <w:t xml:space="preserve">│     </w:t>
+      </w:r>
+      <w:r>
+        <w:rPr>
+          <w:rFonts w:ascii="MS Gothic" w:eastAsia="MS Gothic" w:hAnsi="MS Gothic" w:cs="MS Gothic" w:hint="eastAsia"/>
+        </w:rPr>
+        <w:t>├</w:t>
+      </w:r>
+      <w:r>
+        <w:rPr>
+          <w:rFonts w:ascii="Calibri" w:hAnsi="Calibri" w:cs="Calibri"/>
+        </w:rPr>
+        <w:t>──</w:t>
+      </w:r>
+      <w:r>
+        <w:t xml:space="preserve"> Customers</w:t>
+      </w:r>
+    </w:p>
+    <w:p>
+      <w:r>
+        <w:t xml:space="preserve">│     </w:t>
+      </w:r>
+      <w:r>
+        <w:rPr>
+          <w:rFonts w:ascii="MS Gothic" w:eastAsia="MS Gothic" w:hAnsi="MS Gothic" w:cs="MS Gothic" w:hint="eastAsia"/>
+        </w:rPr>
+        <w:t>├</w:t>
+      </w:r>
+      <w:r>
+        <w:rPr>
+          <w:rFonts w:ascii="Calibri" w:hAnsi="Calibri" w:cs="Calibri"/>
+        </w:rPr>
+        <w:t>──</w:t>
+      </w:r>
+      <w:r>
+        <w:t xml:space="preserve"> Admins</w:t>
+      </w:r>
+    </w:p>
+    <w:p>
+      <w:r>
+        <w:t>│     └── Promote/Demote</w:t>
+      </w:r>
+    </w:p>
+    <w:p>
+      <w:r>
+        <w:t>│</w:t>
+      </w:r>
+    </w:p>
+    <w:p>
+      <w:r>
+        <w:rPr>
+          <w:rFonts w:ascii="MS Gothic" w:eastAsia="MS Gothic" w:hAnsi="MS Gothic" w:cs="MS Gothic" w:hint="eastAsia"/>
+        </w:rPr>
+        <w:t>├</w:t>
+      </w:r>
+      <w:r>
+        <w:rPr>
+          <w:rFonts w:ascii="Calibri" w:hAnsi="Calibri" w:cs="Calibri"/>
+        </w:rPr>
+        <w:t>──</w:t>
+      </w:r>
+      <w:r>
+        <w:t xml:space="preserve"> Manage Orders</w:t>
+      </w:r>
+    </w:p>
+    <w:p>
+      <w:r>
+        <w:t>│</w:t>
+      </w:r>
+    </w:p>
+    <w:p>
+      <w:r>
+        <w:t xml:space="preserve">└── Delivery Applications </w:t>
+      </w:r>
+      <w:r>
+        <w:rPr>
+          <w:rFonts w:ascii="Segoe UI Emoji" w:hAnsi="Segoe UI Emoji" w:cs="Segoe UI Emoji"/>
+        </w:rPr>
+        <w:t>⭐</w:t>
+      </w:r>
+    </w:p>
+    <w:p>
+      <w:r>
+        <w:t xml:space="preserve">      </w:t>
+      </w:r>
+      <w:r>
+        <w:rPr>
+          <w:rFonts w:ascii="MS Gothic" w:eastAsia="MS Gothic" w:hAnsi="MS Gothic" w:cs="MS Gothic" w:hint="eastAsia"/>
+        </w:rPr>
+        <w:t>├</w:t>
+      </w:r>
+      <w:r>
+        <w:rPr>
+          <w:rFonts w:ascii="Calibri" w:hAnsi="Calibri" w:cs="Calibri"/>
+        </w:rPr>
+        <w:t>──</w:t>
+      </w:r>
+      <w:r>
+        <w:t xml:space="preserve"> View Applications</w:t>
+      </w:r>
+    </w:p>
+    <w:p>
+      <w:r>
+        <w:t xml:space="preserve">      </w:t>
+      </w:r>
+      <w:r>
+        <w:rPr>
+          <w:rFonts w:ascii="MS Gothic" w:eastAsia="MS Gothic" w:hAnsi="MS Gothic" w:cs="MS Gothic" w:hint="eastAsia"/>
+        </w:rPr>
+        <w:t>├</w:t>
+      </w:r>
+      <w:r>
+        <w:rPr>
+          <w:rFonts w:ascii="Calibri" w:hAnsi="Calibri" w:cs="Calibri"/>
+        </w:rPr>
+        <w:t>──</w:t>
+      </w:r>
+      <w:r>
+        <w:t xml:space="preserve"> Approve</w:t>
+      </w:r>
+    </w:p>
+    <w:p>
+      <w:r>
+        <w:t xml:space="preserve">      └── Reject</w:t>
+      </w:r>
+    </w:p>
+    <w:p>
+      <w:r>
+        <w:t>This is where the delivery partner workflow begins.</w:t>
+      </w:r>
+    </w:p>
+    <w:p>
+      <w:r>
+        <w:pict w14:anchorId="6B6F5F09">
+          <v:rect id="_x0000_i1103" style="width:0;height:1.5pt" o:hralign="center" o:hrstd="t" o:hr="t" fillcolor="#a0a0a0" stroked="f"/>
+        </w:pict>
+      </w:r>
+    </w:p>
+    <w:p>
+      <w:pPr>
+        <w:rPr>
+          <w:b/>
+          <w:bCs/>
+        </w:rPr>
+      </w:pPr>
+      <w:r>
+        <w:rPr>
+          <w:b/>
+          <w:bCs/>
+        </w:rPr>
+        <w:t xml:space="preserve">Phase 5 – Delivery Partner Module </w:t>
+      </w:r>
+      <w:r>
+        <w:rPr>
+          <w:rFonts w:ascii="Segoe UI Emoji" w:hAnsi="Segoe UI Emoji" w:cs="Segoe UI Emoji"/>
+          <w:b/>
+          <w:bCs/>
+        </w:rPr>
+        <w:t>⭐</w:t>
+      </w:r>
+    </w:p>
+    <w:p>
+      <w:pPr>
+        <w:rPr>
+          <w:b/>
+          <w:bCs/>
+        </w:rPr>
+      </w:pPr>
+      <w:r>
+        <w:rPr>
+          <w:b/>
+          <w:bCs/>
+        </w:rPr>
+        <w:t>1. Become a Delivery Partner</w:t>
+      </w:r>
+    </w:p>
+    <w:p>
+      <w:r>
+        <w:t>Landing Page</w:t>
+      </w:r>
+    </w:p>
+    <w:p/>
+    <w:p>
+      <w:r>
+        <w:t>↓</w:t>
+      </w:r>
+    </w:p>
+    <w:p/>
+    <w:p>
+      <w:r>
+        <w:t>Become Partner</w:t>
+      </w:r>
+    </w:p>
+    <w:p/>
+    <w:p>
+      <w:r>
+        <w:t>↓</w:t>
+      </w:r>
+    </w:p>
+    <w:p/>
+    <w:p>
+      <w:r>
+        <w:t>Application Form</w:t>
+      </w:r>
+    </w:p>
+    <w:p/>
+    <w:p>
+      <w:r>
+        <w:t>↓</w:t>
+      </w:r>
+    </w:p>
+    <w:p/>
+    <w:p>
+      <w:r>
+        <w:t>Upload Documents</w:t>
+      </w:r>
+    </w:p>
+    <w:p/>
+    <w:p>
+      <w:r>
+        <w:t>↓</w:t>
+      </w:r>
+    </w:p>
+    <w:p/>
+    <w:p>
+      <w:r>
+        <w:t>Submit</w:t>
+      </w:r>
+    </w:p>
+    <w:p>
+      <w:r>
+        <w:t>Store in:</w:t>
+      </w:r>
+    </w:p>
+    <w:p>
+      <w:proofErr w:type="spellStart"/>
+      <w:r>
+        <w:t>DeliveryApplications</w:t>
+      </w:r>
+      <w:proofErr w:type="spellEnd"/>
+    </w:p>
+    <w:p>
+      <w:r>
+        <w:t>Status:</w:t>
+      </w:r>
+    </w:p>
+    <w:p>
+      <w:r>
+        <w:t>Pending</w:t>
+      </w:r>
+    </w:p>
+    <w:p>
+      <w:r>
+        <w:pict w14:anchorId="2A9DC9E4">
+          <v:rect id="_x0000_i1104" style="width:0;height:1.5pt" o:hralign="center" o:hrstd="t" o:hr="t" fillcolor="#a0a0a0" stroked="f"/>
+        </w:pict>
+      </w:r>
+    </w:p>
+    <w:p>
+      <w:pPr>
+        <w:rPr>
+          <w:b/>
+          <w:bCs/>
+        </w:rPr>
+      </w:pPr>
+      <w:r>
+        <w:rPr>
+          <w:b/>
+          <w:bCs/>
+        </w:rPr>
+        <w:t>2. Admin Reviews</w:t>
+      </w:r>
+    </w:p>
+    <w:p>
+      <w:r>
+        <w:t>Pending</w:t>
+      </w:r>
+    </w:p>
+    <w:p/>
+    <w:p>
+      <w:r>
+        <w:t>↓</w:t>
+      </w:r>
+    </w:p>
+    <w:p/>
+    <w:p>
+      <w:r>
+        <w:t>Approve</w:t>
+      </w:r>
+    </w:p>
+    <w:p/>
+    <w:p>
+      <w:r>
+        <w:lastRenderedPageBreak/>
+        <w:t>↓</w:t>
+      </w:r>
+    </w:p>
+    <w:p/>
+    <w:p>
+      <w:r>
+        <w:t>Create User</w:t>
+      </w:r>
+    </w:p>
+    <w:p/>
+    <w:p>
+      <w:r>
+        <w:t>↓</w:t>
+      </w:r>
+    </w:p>
+    <w:p/>
+    <w:p>
+      <w:r>
+        <w:t>role = delivery</w:t>
+      </w:r>
+    </w:p>
+    <w:p/>
+    <w:p>
+      <w:r>
+        <w:t>↓</w:t>
+      </w:r>
+    </w:p>
+    <w:p/>
+    <w:p>
+      <w:r>
+        <w:t>Email/Notification</w:t>
+      </w:r>
+    </w:p>
+    <w:p>
+      <w:r>
+        <w:pict w14:anchorId="0256FFC8">
+          <v:rect id="_x0000_i1105" style="width:0;height:1.5pt" o:hralign="center" o:hrstd="t" o:hr="t" fillcolor="#a0a0a0" stroked="f"/>
+        </w:pict>
+      </w:r>
+    </w:p>
+    <w:p>
+      <w:pPr>
+        <w:rPr>
+          <w:b/>
+          <w:bCs/>
+        </w:rPr>
+      </w:pPr>
+      <w:r>
+        <w:rPr>
+          <w:b/>
+          <w:bCs/>
+        </w:rPr>
+        <w:t>3. Delivery Dashboard</w:t>
+      </w:r>
+    </w:p>
+    <w:p>
+      <w:r>
+        <w:t>Delivery Dashboard</w:t>
+      </w:r>
+    </w:p>
+    <w:p/>
+    <w:p>
+      <w:r>
+        <w:rPr>
+          <w:rFonts w:ascii="MS Gothic" w:eastAsia="MS Gothic" w:hAnsi="MS Gothic" w:cs="MS Gothic" w:hint="eastAsia"/>
+        </w:rPr>
+        <w:t>├</w:t>
+      </w:r>
+      <w:r>
+        <w:rPr>
+          <w:rFonts w:ascii="Calibri" w:hAnsi="Calibri" w:cs="Calibri"/>
+        </w:rPr>
+        <w:t>──</w:t>
+      </w:r>
+      <w:r>
+        <w:t xml:space="preserve"> Assigned Orders</w:t>
+      </w:r>
+    </w:p>
+    <w:p>
+      <w:r>
+        <w:rPr>
+          <w:rFonts w:ascii="MS Gothic" w:eastAsia="MS Gothic" w:hAnsi="MS Gothic" w:cs="MS Gothic" w:hint="eastAsia"/>
+        </w:rPr>
+        <w:t>├</w:t>
+      </w:r>
+      <w:r>
+        <w:rPr>
+          <w:rFonts w:ascii="Calibri" w:hAnsi="Calibri" w:cs="Calibri"/>
+        </w:rPr>
+        <w:t>──</w:t>
+      </w:r>
+      <w:r>
+        <w:t xml:space="preserve"> Accept Order</w:t>
+      </w:r>
+    </w:p>
+    <w:p>
+      <w:r>
+        <w:rPr>
+          <w:rFonts w:ascii="MS Gothic" w:eastAsia="MS Gothic" w:hAnsi="MS Gothic" w:cs="MS Gothic" w:hint="eastAsia"/>
+        </w:rPr>
+        <w:t>├</w:t>
+      </w:r>
+      <w:r>
+        <w:rPr>
+          <w:rFonts w:ascii="Calibri" w:hAnsi="Calibri" w:cs="Calibri"/>
+        </w:rPr>
+        <w:t>──</w:t>
+      </w:r>
+      <w:r>
+        <w:t xml:space="preserve"> Pickup Order</w:t>
+      </w:r>
+    </w:p>
+    <w:p>
+      <w:r>
+        <w:rPr>
+          <w:rFonts w:ascii="MS Gothic" w:eastAsia="MS Gothic" w:hAnsi="MS Gothic" w:cs="MS Gothic" w:hint="eastAsia"/>
+        </w:rPr>
+        <w:t>├</w:t>
+      </w:r>
+      <w:r>
+        <w:rPr>
+          <w:rFonts w:ascii="Calibri" w:hAnsi="Calibri" w:cs="Calibri"/>
+        </w:rPr>
+        <w:t>──</w:t>
+      </w:r>
+      <w:r>
+        <w:t xml:space="preserve"> Delivered</w:t>
+      </w:r>
+    </w:p>
+    <w:p>
+      <w:r>
+        <w:rPr>
+          <w:rFonts w:ascii="MS Gothic" w:eastAsia="MS Gothic" w:hAnsi="MS Gothic" w:cs="MS Gothic" w:hint="eastAsia"/>
+        </w:rPr>
+        <w:t>├</w:t>
+      </w:r>
+      <w:r>
+        <w:rPr>
+          <w:rFonts w:ascii="Calibri" w:hAnsi="Calibri" w:cs="Calibri"/>
+        </w:rPr>
+        <w:t>──</w:t>
+      </w:r>
+      <w:r>
+        <w:t xml:space="preserve"> Delivery History</w:t>
+      </w:r>
+    </w:p>
+    <w:p>
+      <w:r>
+        <w:t>└── Earnings (Optional)</w:t>
+      </w:r>
+    </w:p>
+    <w:p>
+      <w:r>
+        <w:pict w14:anchorId="5E9F47DD">
+          <v:rect id="_x0000_i1106" style="width:0;height:1.5pt" o:hralign="center" o:hrstd="t" o:hr="t" fillcolor="#a0a0a0" stroked="f"/>
+        </w:pict>
+      </w:r>
+    </w:p>
+    <w:p>
+      <w:pPr>
+        <w:rPr>
+          <w:b/>
+          <w:bCs/>
+        </w:rPr>
+      </w:pPr>
+      <w:r>
+        <w:rPr>
+          <w:b/>
+          <w:bCs/>
+        </w:rPr>
+        <w:t>Phase 6 – Advanced Features</w:t>
+      </w:r>
+    </w:p>
+    <w:p>
+      <w:r>
+        <w:rPr>
+          <w:rFonts w:ascii="Segoe UI Emoji" w:hAnsi="Segoe UI Emoji" w:cs="Segoe UI Emoji"/>
+        </w:rPr>
+        <w:t>⭐</w:t>
+      </w:r>
+      <w:r>
+        <w:t xml:space="preserve"> Image Upload (Multer + </w:t>
+      </w:r>
+      <w:proofErr w:type="spellStart"/>
+      <w:r>
+        <w:t>Cloudinary</w:t>
+      </w:r>
+      <w:proofErr w:type="spellEnd"/>
+      <w:r>
+        <w:t>)</w:t>
+      </w:r>
+    </w:p>
+    <w:p/>
+    <w:p>
+      <w:r>
+        <w:rPr>
+          <w:rFonts w:ascii="Segoe UI Emoji" w:hAnsi="Segoe UI Emoji" w:cs="Segoe UI Emoji"/>
+        </w:rPr>
+        <w:t>⭐</w:t>
+      </w:r>
+      <w:r>
+        <w:t xml:space="preserve"> Reviews &amp; Ratings</w:t>
+      </w:r>
+    </w:p>
+    <w:p/>
+    <w:p>
+      <w:r>
+        <w:rPr>
+          <w:rFonts w:ascii="Segoe UI Emoji" w:hAnsi="Segoe UI Emoji" w:cs="Segoe UI Emoji"/>
+        </w:rPr>
+        <w:t>⭐</w:t>
+      </w:r>
+      <w:r>
+        <w:t xml:space="preserve"> Coupons</w:t>
+      </w:r>
+    </w:p>
+    <w:p/>
+    <w:p>
+      <w:r>
+        <w:rPr>
+          <w:rFonts w:ascii="Segoe UI Emoji" w:hAnsi="Segoe UI Emoji" w:cs="Segoe UI Emoji"/>
+        </w:rPr>
+        <w:t>⭐</w:t>
+      </w:r>
+      <w:r>
+        <w:t xml:space="preserve"> Notifications</w:t>
+      </w:r>
+    </w:p>
+    <w:p/>
+    <w:p>
+      <w:r>
+        <w:rPr>
+          <w:rFonts w:ascii="Segoe UI Emoji" w:hAnsi="Segoe UI Emoji" w:cs="Segoe UI Emoji"/>
+        </w:rPr>
+        <w:t>⭐</w:t>
+      </w:r>
+      <w:r>
+        <w:t xml:space="preserve"> Live Order Tracking</w:t>
+      </w:r>
+    </w:p>
+    <w:p/>
+    <w:p>
+      <w:r>
+        <w:rPr>
+          <w:rFonts w:ascii="Segoe UI Emoji" w:hAnsi="Segoe UI Emoji" w:cs="Segoe UI Emoji"/>
+        </w:rPr>
+        <w:t>⭐</w:t>
+      </w:r>
+      <w:r>
+        <w:t xml:space="preserve"> Email Verification</w:t>
+      </w:r>
+    </w:p>
+    <w:p/>
+    <w:p>
+      <w:r>
+        <w:rPr>
+          <w:rFonts w:ascii="Segoe UI Emoji" w:hAnsi="Segoe UI Emoji" w:cs="Segoe UI Emoji"/>
+        </w:rPr>
+        <w:t>⭐</w:t>
+      </w:r>
+      <w:r>
+        <w:t xml:space="preserve"> Forgot Password</w:t>
+      </w:r>
+    </w:p>
+    <w:p/>
+    <w:p>
+      <w:r>
+        <w:rPr>
+          <w:rFonts w:ascii="Segoe UI Emoji" w:hAnsi="Segoe UI Emoji" w:cs="Segoe UI Emoji"/>
+        </w:rPr>
+        <w:t>⭐</w:t>
+      </w:r>
+      <w:r>
+        <w:t xml:space="preserve"> Payment Gateway (Stripe/</w:t>
+      </w:r>
+      <w:proofErr w:type="spellStart"/>
+      <w:r>
+        <w:t>Razorpay</w:t>
+      </w:r>
+      <w:proofErr w:type="spellEnd"/>
+      <w:r>
+        <w:t>)</w:t>
+      </w:r>
+    </w:p>
+    <w:p/>
+    <w:p>
+      <w:r>
+        <w:rPr>
+          <w:rFonts w:ascii="Segoe UI Emoji" w:hAnsi="Segoe UI Emoji" w:cs="Segoe UI Emoji"/>
+        </w:rPr>
+        <w:t>⭐</w:t>
+      </w:r>
+      <w:r>
+        <w:t xml:space="preserve"> Analytics Dashboard</w:t>
+      </w:r>
+    </w:p>
+    <w:p>
+      <w:r>
+        <w:pict w14:anchorId="1F94C993">
+          <v:rect id="_x0000_i1107" style="width:0;height:1.5pt" o:hralign="center" o:hrstd="t" o:hr="t" fillcolor="#a0a0a0" stroked="f"/>
+        </w:pict>
+      </w:r>
+    </w:p>
+    <w:p>
+      <w:pPr>
+        <w:rPr>
+          <w:b/>
+          <w:bCs/>
+        </w:rPr>
+      </w:pPr>
+      <w:r>
+        <w:rPr>
+          <w:b/>
+          <w:bCs/>
+        </w:rPr>
+        <w:t>Phase 7 – Deployment</w:t>
+      </w:r>
+    </w:p>
+    <w:p>
+      <w:r>
+        <w:t>Frontend</w:t>
+      </w:r>
+    </w:p>
+    <w:p/>
+    <w:p>
+      <w:r>
+        <w:t>↓</w:t>
+      </w:r>
+    </w:p>
+    <w:p/>
+    <w:p>
+      <w:proofErr w:type="spellStart"/>
+      <w:r>
+        <w:t>Vercel</w:t>
+      </w:r>
+      <w:proofErr w:type="spellEnd"/>
+    </w:p>
+    <w:p/>
+    <w:p>
+      <w:r>
+        <w:t>Backend</w:t>
+      </w:r>
+    </w:p>
+    <w:p/>
+    <w:p>
+      <w:r>
+        <w:t>↓</w:t>
+      </w:r>
+    </w:p>
+    <w:p/>
+    <w:p>
+      <w:r>
+        <w:t>Render</w:t>
+      </w:r>
+    </w:p>
+    <w:p/>
+    <w:p>
+      <w:r>
+        <w:t>Database</w:t>
+      </w:r>
+    </w:p>
+    <w:p/>
+    <w:p>
+      <w:r>
+        <w:t>↓</w:t>
+      </w:r>
+    </w:p>
+    <w:p/>
+    <w:p>
+      <w:r>
+        <w:t>MongoDB Atlas</w:t>
+      </w:r>
+    </w:p>
+    <w:p>
+      <w:r>
+        <w:pict w14:anchorId="2A05C02E">
+          <v:rect id="_x0000_i1108" style="width:0;height:1.5pt" o:hralign="center" o:hrstd="t" o:hr="t" fillcolor="#a0a0a0" stroked="f"/>
+        </w:pict>
+      </w:r>
+    </w:p>
+    <w:p>
+      <w:pPr>
+        <w:rPr>
+          <w:b/>
+          <w:bCs/>
+        </w:rPr>
+      </w:pPr>
+      <w:r>
+        <w:rPr>
+          <w:rFonts w:ascii="Segoe UI Emoji" w:hAnsi="Segoe UI Emoji" w:cs="Segoe UI Emoji"/>
+          <w:b/>
+          <w:bCs/>
+        </w:rPr>
+        <w:t>📁</w:t>
+      </w:r>
+      <w:r>
+        <w:rPr>
+          <w:b/>
+          <w:bCs/>
+        </w:rPr>
+        <w:t xml:space="preserve"> Final Project Structure</w:t>
+      </w:r>
+    </w:p>
+    <w:p>
+      <w:proofErr w:type="spellStart"/>
+      <w:r>
+        <w:t>FoodHub</w:t>
+      </w:r>
+      <w:proofErr w:type="spellEnd"/>
+    </w:p>
+    <w:p/>
+    <w:p>
+      <w:r>
+        <w:rPr>
+          <w:rFonts w:ascii="MS Gothic" w:eastAsia="MS Gothic" w:hAnsi="MS Gothic" w:cs="MS Gothic" w:hint="eastAsia"/>
+        </w:rPr>
+        <w:t>├</w:t>
+      </w:r>
+      <w:r>
+        <w:rPr>
+          <w:rFonts w:ascii="Calibri" w:hAnsi="Calibri" w:cs="Calibri"/>
+        </w:rPr>
+        <w:t>──</w:t>
+      </w:r>
+      <w:r>
+        <w:t xml:space="preserve"> Customer Portal</w:t>
+      </w:r>
+    </w:p>
+    <w:p>
+      <w:r>
+        <w:t>│     Home</w:t>
+      </w:r>
+    </w:p>
+    <w:p>
+      <w:r>
+        <w:t>│     Menu</w:t>
+      </w:r>
+    </w:p>
+    <w:p>
+      <w:r>
+        <w:t>│     Cart</w:t>
+      </w:r>
+    </w:p>
+    <w:p>
+      <w:r>
+        <w:t>│     Orders</w:t>
+      </w:r>
+    </w:p>
+    <w:p>
+      <w:r>
+        <w:t>│</w:t>
+      </w:r>
+    </w:p>
+    <w:p>
+      <w:r>
+        <w:rPr>
+          <w:rFonts w:ascii="MS Gothic" w:eastAsia="MS Gothic" w:hAnsi="MS Gothic" w:cs="MS Gothic" w:hint="eastAsia"/>
+        </w:rPr>
+        <w:t>├</w:t>
+      </w:r>
+      <w:r>
+        <w:rPr>
+          <w:rFonts w:ascii="Calibri" w:hAnsi="Calibri" w:cs="Calibri"/>
+        </w:rPr>
+        <w:t>──</w:t>
+      </w:r>
+      <w:r>
+        <w:t xml:space="preserve"> Admin Portal</w:t>
+      </w:r>
+    </w:p>
+    <w:p>
+      <w:r>
+        <w:t>│     Dashboard</w:t>
+      </w:r>
+    </w:p>
+    <w:p>
+      <w:r>
+        <w:t>│     Foods</w:t>
+      </w:r>
+    </w:p>
+    <w:p>
+      <w:r>
+        <w:t>│     Categories</w:t>
+      </w:r>
+    </w:p>
+    <w:p>
+      <w:r>
+        <w:t>│     Users</w:t>
+      </w:r>
+    </w:p>
+    <w:p>
+      <w:r>
+        <w:t>│     Delivery Applications</w:t>
+      </w:r>
+    </w:p>
+    <w:p>
+      <w:r>
+        <w:t>│</w:t>
+      </w:r>
+    </w:p>
+    <w:p>
+      <w:r>
+        <w:rPr>
+          <w:rFonts w:ascii="MS Gothic" w:eastAsia="MS Gothic" w:hAnsi="MS Gothic" w:cs="MS Gothic" w:hint="eastAsia"/>
+        </w:rPr>
+        <w:t>├</w:t>
+      </w:r>
+      <w:r>
+        <w:rPr>
+          <w:rFonts w:ascii="Calibri" w:hAnsi="Calibri" w:cs="Calibri"/>
+        </w:rPr>
+        <w:t>──</w:t>
+      </w:r>
+      <w:r>
+        <w:t xml:space="preserve"> Delivery Portal</w:t>
+      </w:r>
+    </w:p>
+    <w:p>
+      <w:r>
+        <w:lastRenderedPageBreak/>
+        <w:t>│     Dashboard</w:t>
+      </w:r>
+    </w:p>
+    <w:p>
+      <w:r>
+        <w:t>│     Assigned Orders</w:t>
+      </w:r>
+    </w:p>
+    <w:p>
+      <w:r>
+        <w:t>│     Delivery History</w:t>
+      </w:r>
+    </w:p>
+    <w:p>
+      <w:r>
+        <w:t>│</w:t>
+      </w:r>
+    </w:p>
+    <w:p>
+      <w:r>
+        <w:t>└── Shared</w:t>
+      </w:r>
+    </w:p>
+    <w:p>
+      <w:r>
+        <w:t xml:space="preserve">      Login</w:t>
+      </w:r>
+    </w:p>
+    <w:p>
+      <w:r>
+        <w:t xml:space="preserve">      Register</w:t>
+      </w:r>
+    </w:p>
+    <w:p>
+      <w:r>
+        <w:t xml:space="preserve">      Navbar</w:t>
+      </w:r>
+    </w:p>
+    <w:p>
+      <w:r>
+        <w:pict w14:anchorId="39AA6BE5">
+          <v:rect id="_x0000_i1109" style="width:0;height:1.5pt" o:hralign="center" o:hrstd="t" o:hr="t" fillcolor="#a0a0a0" stroked="f"/>
+        </w:pict>
+      </w:r>
+    </w:p>
+    <w:p>
+      <w:pPr>
+        <w:rPr>
+          <w:b/>
+          <w:bCs/>
+        </w:rPr>
+      </w:pPr>
+      <w:r>
+        <w:rPr>
+          <w:rFonts w:ascii="Segoe UI Emoji" w:hAnsi="Segoe UI Emoji" w:cs="Segoe UI Emoji"/>
+          <w:b/>
+          <w:bCs/>
+        </w:rPr>
+        <w:t>🎯</w:t>
+      </w:r>
+      <w:r>
+        <w:rPr>
+          <w:b/>
+          <w:bCs/>
+        </w:rPr>
+        <w:t xml:space="preserve"> Database Collections</w:t>
+      </w:r>
+    </w:p>
+    <w:p>
+      <w:r>
+        <w:t>Users</w:t>
+      </w:r>
+    </w:p>
+    <w:p/>
+    <w:p>
+      <w:r>
+        <w:t>Foods</w:t>
+      </w:r>
+    </w:p>
+    <w:p/>
+    <w:p>
+      <w:r>
+        <w:t>Categories</w:t>
+      </w:r>
+    </w:p>
+    <w:p/>
+    <w:p>
+      <w:r>
+        <w:t>Orders</w:t>
+      </w:r>
+    </w:p>
+    <w:p/>
+    <w:p>
+      <w:r>
+        <w:t>Cart</w:t>
+      </w:r>
+    </w:p>
+    <w:p/>
+    <w:p>
+      <w:proofErr w:type="spellStart"/>
+      <w:r>
+        <w:t>DeliveryApplications</w:t>
+      </w:r>
+      <w:proofErr w:type="spellEnd"/>
+    </w:p>
+    <w:p/>
+    <w:p>
+      <w:r>
+        <w:t>Reviews</w:t>
       </w:r>
     </w:p>
     <w:p/>

</xml_diff>

<commit_message>
Complete customer Address  module with full CRUD operations and React integration
</commit_message>
<xml_diff>
--- a/docs/foodhub_Roadmap.docx
+++ b/docs/foodhub_Roadmap.docx
@@ -137,15 +137,7 @@
         </w:numPr>
       </w:pPr>
       <w:r>
-        <w:t>State (</w:t>
-      </w:r>
-      <w:proofErr w:type="spellStart"/>
-      <w:r>
-        <w:t>useState</w:t>
-      </w:r>
-      <w:proofErr w:type="spellEnd"/>
-      <w:r>
-        <w:t xml:space="preserve">) </w:t>
+        <w:t xml:space="preserve">State (useState) </w:t>
       </w:r>
     </w:p>
     <w:p>
@@ -192,13 +184,8 @@
           <w:numId w:val="2"/>
         </w:numPr>
       </w:pPr>
-      <w:proofErr w:type="spellStart"/>
-      <w:r>
-        <w:t>npm</w:t>
-      </w:r>
-      <w:proofErr w:type="spellEnd"/>
-      <w:r>
-        <w:t xml:space="preserve"> </w:t>
+      <w:r>
+        <w:t xml:space="preserve">npm </w:t>
       </w:r>
     </w:p>
     <w:p>
@@ -373,13 +360,8 @@
           <w:numId w:val="4"/>
         </w:numPr>
       </w:pPr>
-      <w:proofErr w:type="spellStart"/>
-      <w:r>
-        <w:t>bcrypt</w:t>
-      </w:r>
-      <w:proofErr w:type="spellEnd"/>
-      <w:r>
-        <w:t xml:space="preserve"> </w:t>
+      <w:r>
+        <w:t xml:space="preserve">bcrypt </w:t>
       </w:r>
     </w:p>
     <w:p>
@@ -951,23 +933,7 @@
           <w:b/>
           <w:bCs/>
         </w:rPr>
-        <w:t xml:space="preserve"> Step 2 (2–3 </w:t>
-      </w:r>
-      <w:proofErr w:type="spellStart"/>
-      <w:r>
-        <w:rPr>
-          <w:b/>
-          <w:bCs/>
-        </w:rPr>
-        <w:t>hrs</w:t>
-      </w:r>
-      <w:proofErr w:type="spellEnd"/>
-      <w:r>
-        <w:rPr>
-          <w:b/>
-          <w:bCs/>
-        </w:rPr>
-        <w:t>)</w:t>
+        <w:t xml:space="preserve"> Step 2 (2–3 hrs)</w:t>
       </w:r>
     </w:p>
     <w:p>
@@ -1193,15 +1159,7 @@
         </w:numPr>
       </w:pPr>
       <w:r>
-        <w:t>Password Hashing (</w:t>
-      </w:r>
-      <w:proofErr w:type="spellStart"/>
-      <w:r>
-        <w:t>bcrypt</w:t>
-      </w:r>
-      <w:proofErr w:type="spellEnd"/>
-      <w:r>
-        <w:t xml:space="preserve">) </w:t>
+        <w:t xml:space="preserve">Password Hashing (bcrypt) </w:t>
       </w:r>
     </w:p>
     <w:p>
@@ -1264,13 +1222,8 @@
           <w:numId w:val="14"/>
         </w:numPr>
       </w:pPr>
-      <w:proofErr w:type="spellStart"/>
-      <w:r>
-        <w:t>bcrypt</w:t>
-      </w:r>
-      <w:proofErr w:type="spellEnd"/>
-      <w:r>
-        <w:t xml:space="preserve"> </w:t>
+      <w:r>
+        <w:t xml:space="preserve">bcrypt </w:t>
       </w:r>
     </w:p>
     <w:p>
@@ -2006,13 +1959,8 @@
           <w:numId w:val="25"/>
         </w:numPr>
       </w:pPr>
-      <w:proofErr w:type="spellStart"/>
-      <w:r>
-        <w:t>useState</w:t>
-      </w:r>
-      <w:proofErr w:type="spellEnd"/>
-      <w:r>
-        <w:t xml:space="preserve"> </w:t>
+      <w:r>
+        <w:t xml:space="preserve">useState </w:t>
       </w:r>
     </w:p>
     <w:p>
@@ -2022,13 +1970,8 @@
           <w:numId w:val="25"/>
         </w:numPr>
       </w:pPr>
-      <w:proofErr w:type="spellStart"/>
-      <w:r>
-        <w:t>useEffect</w:t>
-      </w:r>
-      <w:proofErr w:type="spellEnd"/>
-      <w:r>
-        <w:t xml:space="preserve"> </w:t>
+      <w:r>
+        <w:t xml:space="preserve">useEffect </w:t>
       </w:r>
     </w:p>
     <w:p>
@@ -2154,13 +2097,8 @@
           <w:numId w:val="27"/>
         </w:numPr>
       </w:pPr>
-      <w:proofErr w:type="spellStart"/>
-      <w:r>
-        <w:t>Razorpay</w:t>
-      </w:r>
-      <w:proofErr w:type="spellEnd"/>
-      <w:r>
-        <w:t xml:space="preserve"> Payment </w:t>
+      <w:r>
+        <w:t xml:space="preserve">Razorpay Payment </w:t>
       </w:r>
     </w:p>
     <w:p>
@@ -2525,13 +2463,8 @@
           <w:numId w:val="30"/>
         </w:numPr>
       </w:pPr>
-      <w:proofErr w:type="spellStart"/>
-      <w:r>
-        <w:t>Razorpay</w:t>
-      </w:r>
-      <w:proofErr w:type="spellEnd"/>
-      <w:r>
-        <w:t xml:space="preserve"> </w:t>
+      <w:r>
+        <w:t xml:space="preserve">Razorpay </w:t>
       </w:r>
     </w:p>
     <w:p>
@@ -2593,22 +2526,13 @@
           <w:bCs/>
         </w:rPr>
       </w:pPr>
-      <w:proofErr w:type="spellStart"/>
       <w:r>
         <w:rPr>
           <w:b/>
           <w:bCs/>
         </w:rPr>
         <w:lastRenderedPageBreak/>
-        <w:t>FoodHub</w:t>
-      </w:r>
-      <w:proofErr w:type="spellEnd"/>
-      <w:r>
-        <w:rPr>
-          <w:b/>
-          <w:bCs/>
-        </w:rPr>
-        <w:t xml:space="preserve"> Complete Roadmap (v2)</w:t>
+        <w:t>FoodHub Complete Roadmap (v2)</w:t>
       </w:r>
     </w:p>
     <w:p>
@@ -2754,7 +2678,7 @@
     <w:p>
       <w:r>
         <w:pict w14:anchorId="64B86B9F">
-          <v:rect id="_x0000_i1100" style="width:0;height:1.5pt" o:hralign="center" o:hrstd="t" o:hr="t" fillcolor="#a0a0a0" stroked="f"/>
+          <v:rect id="_x0000_i1040" style="width:0;height:1.5pt" o:hralign="center" o:hrstd="t" o:hr="t" fillcolor="#a0a0a0" stroked="f"/>
         </w:pict>
       </w:r>
     </w:p>
@@ -2850,15 +2774,7 @@
         <w:t>──</w:t>
       </w:r>
       <w:r>
-        <w:t xml:space="preserve"> Password Hashing (</w:t>
-      </w:r>
-      <w:proofErr w:type="spellStart"/>
-      <w:r>
-        <w:t>bcrypt</w:t>
-      </w:r>
-      <w:proofErr w:type="spellEnd"/>
-      <w:r>
-        <w:t>)</w:t>
+        <w:t xml:space="preserve"> Password Hashing (bcrypt)</w:t>
       </w:r>
     </w:p>
     <w:p>
@@ -2976,7 +2892,7 @@
     <w:p>
       <w:r>
         <w:pict w14:anchorId="1205A9E7">
-          <v:rect id="_x0000_i1101" style="width:0;height:1.5pt" o:hralign="center" o:hrstd="t" o:hr="t" fillcolor="#a0a0a0" stroked="f"/>
+          <v:rect id="_x0000_i1041" style="width:0;height:1.5pt" o:hralign="center" o:hrstd="t" o:hr="t" fillcolor="#a0a0a0" stroked="f"/>
         </w:pict>
       </w:r>
     </w:p>
@@ -3162,7 +3078,7 @@
     <w:p>
       <w:r>
         <w:pict w14:anchorId="7E53AF0C">
-          <v:rect id="_x0000_i1102" style="width:0;height:1.5pt" o:hralign="center" o:hrstd="t" o:hr="t" fillcolor="#a0a0a0" stroked="f"/>
+          <v:rect id="_x0000_i1042" style="width:0;height:1.5pt" o:hralign="center" o:hrstd="t" o:hr="t" fillcolor="#a0a0a0" stroked="f"/>
         </w:pict>
       </w:r>
     </w:p>
@@ -3447,7 +3363,7 @@
     <w:p>
       <w:r>
         <w:pict w14:anchorId="6B6F5F09">
-          <v:rect id="_x0000_i1103" style="width:0;height:1.5pt" o:hralign="center" o:hrstd="t" o:hr="t" fillcolor="#a0a0a0" stroked="f"/>
+          <v:rect id="_x0000_i1043" style="width:0;height:1.5pt" o:hralign="center" o:hrstd="t" o:hr="t" fillcolor="#a0a0a0" stroked="f"/>
         </w:pict>
       </w:r>
     </w:p>
@@ -3548,11 +3464,9 @@
       </w:r>
     </w:p>
     <w:p>
-      <w:proofErr w:type="spellStart"/>
       <w:r>
         <w:t>DeliveryApplications</w:t>
       </w:r>
-      <w:proofErr w:type="spellEnd"/>
     </w:p>
     <w:p>
       <w:r>
@@ -3567,7 +3481,7 @@
     <w:p>
       <w:r>
         <w:pict w14:anchorId="2A9DC9E4">
-          <v:rect id="_x0000_i1104" style="width:0;height:1.5pt" o:hralign="center" o:hrstd="t" o:hr="t" fillcolor="#a0a0a0" stroked="f"/>
+          <v:rect id="_x0000_i1044" style="width:0;height:1.5pt" o:hralign="center" o:hrstd="t" o:hr="t" fillcolor="#a0a0a0" stroked="f"/>
         </w:pict>
       </w:r>
     </w:p>
@@ -3643,7 +3557,7 @@
     <w:p>
       <w:r>
         <w:pict w14:anchorId="0256FFC8">
-          <v:rect id="_x0000_i1105" style="width:0;height:1.5pt" o:hralign="center" o:hrstd="t" o:hr="t" fillcolor="#a0a0a0" stroked="f"/>
+          <v:rect id="_x0000_i1045" style="width:0;height:1.5pt" o:hralign="center" o:hrstd="t" o:hr="t" fillcolor="#a0a0a0" stroked="f"/>
         </w:pict>
       </w:r>
     </w:p>
@@ -3761,7 +3675,7 @@
     <w:p>
       <w:r>
         <w:pict w14:anchorId="5E9F47DD">
-          <v:rect id="_x0000_i1106" style="width:0;height:1.5pt" o:hralign="center" o:hrstd="t" o:hr="t" fillcolor="#a0a0a0" stroked="f"/>
+          <v:rect id="_x0000_i1046" style="width:0;height:1.5pt" o:hralign="center" o:hrstd="t" o:hr="t" fillcolor="#a0a0a0" stroked="f"/>
         </w:pict>
       </w:r>
     </w:p>
@@ -3788,15 +3702,7 @@
         <w:t>⭐</w:t>
       </w:r>
       <w:r>
-        <w:t xml:space="preserve"> Image Upload (Multer + </w:t>
-      </w:r>
-      <w:proofErr w:type="spellStart"/>
-      <w:r>
-        <w:t>Cloudinary</w:t>
-      </w:r>
-      <w:proofErr w:type="spellEnd"/>
-      <w:r>
-        <w:t>)</w:t>
+        <w:t xml:space="preserve"> Image Upload (Multer + Cloudinary)</w:t>
       </w:r>
     </w:p>
     <w:p/>
@@ -3880,15 +3786,7 @@
         <w:t>⭐</w:t>
       </w:r>
       <w:r>
-        <w:t xml:space="preserve"> Payment Gateway (Stripe/</w:t>
-      </w:r>
-      <w:proofErr w:type="spellStart"/>
-      <w:r>
-        <w:t>Razorpay</w:t>
-      </w:r>
-      <w:proofErr w:type="spellEnd"/>
-      <w:r>
-        <w:t>)</w:t>
+        <w:t xml:space="preserve"> Payment Gateway (Stripe/Razorpay)</w:t>
       </w:r>
     </w:p>
     <w:p/>
@@ -3906,7 +3804,7 @@
     <w:p>
       <w:r>
         <w:pict w14:anchorId="1F94C993">
-          <v:rect id="_x0000_i1107" style="width:0;height:1.5pt" o:hralign="center" o:hrstd="t" o:hr="t" fillcolor="#a0a0a0" stroked="f"/>
+          <v:rect id="_x0000_i1047" style="width:0;height:1.5pt" o:hralign="center" o:hrstd="t" o:hr="t" fillcolor="#a0a0a0" stroked="f"/>
         </w:pict>
       </w:r>
     </w:p>
@@ -3938,11 +3836,9 @@
     </w:p>
     <w:p/>
     <w:p>
-      <w:proofErr w:type="spellStart"/>
       <w:r>
         <w:t>Vercel</w:t>
       </w:r>
-      <w:proofErr w:type="spellEnd"/>
     </w:p>
     <w:p/>
     <w:p>
@@ -3983,7 +3879,7 @@
     <w:p>
       <w:r>
         <w:pict w14:anchorId="2A05C02E">
-          <v:rect id="_x0000_i1108" style="width:0;height:1.5pt" o:hralign="center" o:hrstd="t" o:hr="t" fillcolor="#a0a0a0" stroked="f"/>
+          <v:rect id="_x0000_i1048" style="width:0;height:1.5pt" o:hralign="center" o:hrstd="t" o:hr="t" fillcolor="#a0a0a0" stroked="f"/>
         </w:pict>
       </w:r>
     </w:p>
@@ -4011,11 +3907,9 @@
       </w:r>
     </w:p>
     <w:p>
-      <w:proofErr w:type="spellStart"/>
       <w:r>
         <w:t>FoodHub</w:t>
       </w:r>
-      <w:proofErr w:type="spellEnd"/>
     </w:p>
     <w:p/>
     <w:p>
@@ -4168,7 +4062,7 @@
     <w:p>
       <w:r>
         <w:pict w14:anchorId="39AA6BE5">
-          <v:rect id="_x0000_i1109" style="width:0;height:1.5pt" o:hralign="center" o:hrstd="t" o:hr="t" fillcolor="#a0a0a0" stroked="f"/>
+          <v:rect id="_x0000_i1049" style="width:0;height:1.5pt" o:hralign="center" o:hrstd="t" o:hr="t" fillcolor="#a0a0a0" stroked="f"/>
         </w:pict>
       </w:r>
     </w:p>
@@ -4226,11 +4120,9 @@
     </w:p>
     <w:p/>
     <w:p>
-      <w:proofErr w:type="spellStart"/>
       <w:r>
         <w:t>DeliveryApplications</w:t>
       </w:r>
-      <w:proofErr w:type="spellEnd"/>
     </w:p>
     <w:p/>
     <w:p>
@@ -4239,6 +4131,817 @@
       </w:r>
     </w:p>
     <w:p/>
+    <w:p/>
+    <w:p/>
+    <w:p>
+      <w:pPr>
+        <w:rPr>
+          <w:b/>
+          <w:bCs/>
+        </w:rPr>
+      </w:pPr>
+      <w:r>
+        <w:rPr>
+          <w:b/>
+          <w:bCs/>
+        </w:rPr>
+        <w:lastRenderedPageBreak/>
+        <w:t>My recommended roadmap</w:t>
+      </w:r>
+    </w:p>
+    <w:p>
+      <w:pPr>
+        <w:rPr>
+          <w:b/>
+          <w:bCs/>
+        </w:rPr>
+      </w:pPr>
+      <w:r>
+        <w:rPr>
+          <w:b/>
+          <w:bCs/>
+        </w:rPr>
+        <w:t xml:space="preserve">Phase 1 – Authentication </w:t>
+      </w:r>
+      <w:r>
+        <w:rPr>
+          <w:rFonts w:ascii="Segoe UI Emoji" w:hAnsi="Segoe UI Emoji" w:cs="Segoe UI Emoji"/>
+          <w:b/>
+          <w:bCs/>
+        </w:rPr>
+        <w:t>✅</w:t>
+      </w:r>
+    </w:p>
+    <w:p>
+      <w:pPr>
+        <w:numPr>
+          <w:ilvl w:val="0"/>
+          <w:numId w:val="31"/>
+        </w:numPr>
+      </w:pPr>
+      <w:r>
+        <w:t xml:space="preserve">Register </w:t>
+      </w:r>
+    </w:p>
+    <w:p>
+      <w:pPr>
+        <w:numPr>
+          <w:ilvl w:val="0"/>
+          <w:numId w:val="31"/>
+        </w:numPr>
+      </w:pPr>
+      <w:r>
+        <w:t xml:space="preserve">Login </w:t>
+      </w:r>
+    </w:p>
+    <w:p>
+      <w:pPr>
+        <w:numPr>
+          <w:ilvl w:val="0"/>
+          <w:numId w:val="31"/>
+        </w:numPr>
+      </w:pPr>
+      <w:r>
+        <w:t xml:space="preserve">JWT </w:t>
+      </w:r>
+    </w:p>
+    <w:p>
+      <w:pPr>
+        <w:numPr>
+          <w:ilvl w:val="0"/>
+          <w:numId w:val="31"/>
+        </w:numPr>
+      </w:pPr>
+      <w:r>
+        <w:t xml:space="preserve">Logout </w:t>
+      </w:r>
+    </w:p>
+    <w:p>
+      <w:pPr>
+        <w:numPr>
+          <w:ilvl w:val="0"/>
+          <w:numId w:val="31"/>
+        </w:numPr>
+      </w:pPr>
+      <w:r>
+        <w:t xml:space="preserve">Auth Middleware </w:t>
+      </w:r>
+    </w:p>
+    <w:p>
+      <w:pPr>
+        <w:numPr>
+          <w:ilvl w:val="0"/>
+          <w:numId w:val="31"/>
+        </w:numPr>
+      </w:pPr>
+      <w:r>
+        <w:t xml:space="preserve">Protected Routes </w:t>
+      </w:r>
+    </w:p>
+    <w:p>
+      <w:pPr>
+        <w:rPr>
+          <w:b/>
+          <w:bCs/>
+        </w:rPr>
+      </w:pPr>
+      <w:r>
+        <w:rPr>
+          <w:b/>
+          <w:bCs/>
+        </w:rPr>
+        <w:t xml:space="preserve">Phase 2 – Food &amp; Cart </w:t>
+      </w:r>
+      <w:r>
+        <w:rPr>
+          <w:rFonts w:ascii="Segoe UI Emoji" w:hAnsi="Segoe UI Emoji" w:cs="Segoe UI Emoji"/>
+          <w:b/>
+          <w:bCs/>
+        </w:rPr>
+        <w:t>✅</w:t>
+      </w:r>
+    </w:p>
+    <w:p>
+      <w:pPr>
+        <w:numPr>
+          <w:ilvl w:val="0"/>
+          <w:numId w:val="32"/>
+        </w:numPr>
+      </w:pPr>
+      <w:r>
+        <w:t xml:space="preserve">Food CRUD (backend) </w:t>
+      </w:r>
+    </w:p>
+    <w:p>
+      <w:pPr>
+        <w:numPr>
+          <w:ilvl w:val="0"/>
+          <w:numId w:val="32"/>
+        </w:numPr>
+      </w:pPr>
+      <w:r>
+        <w:t xml:space="preserve">Home Page </w:t>
+      </w:r>
+    </w:p>
+    <w:p>
+      <w:pPr>
+        <w:numPr>
+          <w:ilvl w:val="0"/>
+          <w:numId w:val="32"/>
+        </w:numPr>
+      </w:pPr>
+      <w:r>
+        <w:t xml:space="preserve">Add to Cart </w:t>
+      </w:r>
+    </w:p>
+    <w:p>
+      <w:pPr>
+        <w:numPr>
+          <w:ilvl w:val="0"/>
+          <w:numId w:val="32"/>
+        </w:numPr>
+      </w:pPr>
+      <w:r>
+        <w:t xml:space="preserve">Cart CRUD </w:t>
+      </w:r>
+    </w:p>
+    <w:p>
+      <w:pPr>
+        <w:numPr>
+          <w:ilvl w:val="0"/>
+          <w:numId w:val="32"/>
+        </w:numPr>
+      </w:pPr>
+      <w:r>
+        <w:t xml:space="preserve">Cart UI </w:t>
+      </w:r>
+    </w:p>
+    <w:p>
+      <w:r>
+        <w:pict w14:anchorId="6B29800E">
+          <v:rect id="_x0000_i1080" style="width:0;height:1.5pt" o:hralign="center" o:hrstd="t" o:hr="t" fillcolor="#a0a0a0" stroked="f"/>
+        </w:pict>
+      </w:r>
+    </w:p>
+    <w:p>
+      <w:pPr>
+        <w:rPr>
+          <w:b/>
+          <w:bCs/>
+        </w:rPr>
+      </w:pPr>
+      <w:r>
+        <w:rPr>
+          <w:b/>
+          <w:bCs/>
+        </w:rPr>
+        <w:t xml:space="preserve">Phase 3 – Customer Order Flow </w:t>
+      </w:r>
+      <w:r>
+        <w:rPr>
+          <w:rFonts w:ascii="Segoe UI Emoji" w:hAnsi="Segoe UI Emoji" w:cs="Segoe UI Emoji"/>
+          <w:b/>
+          <w:bCs/>
+        </w:rPr>
+        <w:t>⭐</w:t>
+      </w:r>
+      <w:r>
+        <w:rPr>
+          <w:b/>
+          <w:bCs/>
+        </w:rPr>
+        <w:t xml:space="preserve"> (Next)</w:t>
+      </w:r>
+    </w:p>
+    <w:p>
+      <w:r>
+        <w:t>This completes the main customer journey.</w:t>
+      </w:r>
+    </w:p>
+    <w:p>
+      <w:pPr>
+        <w:numPr>
+          <w:ilvl w:val="0"/>
+          <w:numId w:val="33"/>
+        </w:numPr>
+      </w:pPr>
+      <w:r>
+        <w:t xml:space="preserve">Address Management </w:t>
+      </w:r>
+    </w:p>
+    <w:p>
+      <w:pPr>
+        <w:numPr>
+          <w:ilvl w:val="0"/>
+          <w:numId w:val="33"/>
+        </w:numPr>
+      </w:pPr>
+      <w:r>
+        <w:t xml:space="preserve">Checkout </w:t>
+      </w:r>
+    </w:p>
+    <w:p>
+      <w:pPr>
+        <w:numPr>
+          <w:ilvl w:val="0"/>
+          <w:numId w:val="33"/>
+        </w:numPr>
+      </w:pPr>
+      <w:r>
+        <w:t xml:space="preserve">Place Order </w:t>
+      </w:r>
+    </w:p>
+    <w:p>
+      <w:pPr>
+        <w:numPr>
+          <w:ilvl w:val="0"/>
+          <w:numId w:val="33"/>
+        </w:numPr>
+      </w:pPr>
+      <w:r>
+        <w:t xml:space="preserve">My Orders </w:t>
+      </w:r>
+    </w:p>
+    <w:p>
+      <w:pPr>
+        <w:numPr>
+          <w:ilvl w:val="0"/>
+          <w:numId w:val="33"/>
+        </w:numPr>
+      </w:pPr>
+      <w:r>
+        <w:t xml:space="preserve">Order Details </w:t>
+      </w:r>
+    </w:p>
+    <w:p>
+      <w:pPr>
+        <w:numPr>
+          <w:ilvl w:val="0"/>
+          <w:numId w:val="33"/>
+        </w:numPr>
+      </w:pPr>
+      <w:r>
+        <w:t xml:space="preserve">Cancel Order (before accepted) </w:t>
+      </w:r>
+    </w:p>
+    <w:p>
+      <w:r>
+        <w:t xml:space="preserve">At this point, a customer can </w:t>
+      </w:r>
+      <w:r>
+        <w:rPr>
+          <w:b/>
+          <w:bCs/>
+        </w:rPr>
+        <w:t>actually order food</w:t>
+      </w:r>
+      <w:r>
+        <w:t>.</w:t>
+      </w:r>
+    </w:p>
+    <w:p>
+      <w:r>
+        <w:pict w14:anchorId="3222971E">
+          <v:rect id="_x0000_i1081" style="width:0;height:1.5pt" o:hralign="center" o:hrstd="t" o:hr="t" fillcolor="#a0a0a0" stroked="f"/>
+        </w:pict>
+      </w:r>
+    </w:p>
+    <w:p>
+      <w:pPr>
+        <w:rPr>
+          <w:b/>
+          <w:bCs/>
+        </w:rPr>
+      </w:pPr>
+      <w:r>
+        <w:rPr>
+          <w:b/>
+          <w:bCs/>
+        </w:rPr>
+        <w:t xml:space="preserve">Phase 4 – Admin Module </w:t>
+      </w:r>
+      <w:r>
+        <w:rPr>
+          <w:rFonts w:ascii="Segoe UI Emoji" w:hAnsi="Segoe UI Emoji" w:cs="Segoe UI Emoji"/>
+          <w:b/>
+          <w:bCs/>
+        </w:rPr>
+        <w:t>⭐⭐⭐</w:t>
+      </w:r>
+    </w:p>
+    <w:p>
+      <w:r>
+        <w:lastRenderedPageBreak/>
+        <w:t>Now build the admin because customer ordering is complete.</w:t>
+      </w:r>
+    </w:p>
+    <w:p>
+      <w:pPr>
+        <w:numPr>
+          <w:ilvl w:val="0"/>
+          <w:numId w:val="34"/>
+        </w:numPr>
+      </w:pPr>
+      <w:r>
+        <w:t xml:space="preserve">Admin Login </w:t>
+      </w:r>
+    </w:p>
+    <w:p>
+      <w:pPr>
+        <w:numPr>
+          <w:ilvl w:val="0"/>
+          <w:numId w:val="34"/>
+        </w:numPr>
+      </w:pPr>
+      <w:r>
+        <w:t xml:space="preserve">Dashboard </w:t>
+      </w:r>
+    </w:p>
+    <w:p>
+      <w:pPr>
+        <w:numPr>
+          <w:ilvl w:val="0"/>
+          <w:numId w:val="34"/>
+        </w:numPr>
+      </w:pPr>
+      <w:r>
+        <w:t xml:space="preserve">Food CRUD UI </w:t>
+      </w:r>
+    </w:p>
+    <w:p>
+      <w:pPr>
+        <w:numPr>
+          <w:ilvl w:val="0"/>
+          <w:numId w:val="34"/>
+        </w:numPr>
+      </w:pPr>
+      <w:r>
+        <w:t xml:space="preserve">Category CRUD </w:t>
+      </w:r>
+    </w:p>
+    <w:p>
+      <w:pPr>
+        <w:numPr>
+          <w:ilvl w:val="0"/>
+          <w:numId w:val="34"/>
+        </w:numPr>
+      </w:pPr>
+      <w:r>
+        <w:t xml:space="preserve">User Management </w:t>
+      </w:r>
+    </w:p>
+    <w:p>
+      <w:pPr>
+        <w:numPr>
+          <w:ilvl w:val="0"/>
+          <w:numId w:val="34"/>
+        </w:numPr>
+      </w:pPr>
+      <w:r>
+        <w:t xml:space="preserve">Order Management </w:t>
+      </w:r>
+    </w:p>
+    <w:p>
+      <w:pPr>
+        <w:numPr>
+          <w:ilvl w:val="0"/>
+          <w:numId w:val="34"/>
+        </w:numPr>
+      </w:pPr>
+      <w:r>
+        <w:t xml:space="preserve">Delivery Partner Approval </w:t>
+      </w:r>
+    </w:p>
+    <w:p>
+      <w:pPr>
+        <w:numPr>
+          <w:ilvl w:val="0"/>
+          <w:numId w:val="34"/>
+        </w:numPr>
+      </w:pPr>
+      <w:r>
+        <w:t xml:space="preserve">Reports </w:t>
+      </w:r>
+    </w:p>
+    <w:p>
+      <w:r>
+        <w:pict w14:anchorId="740C2174">
+          <v:rect id="_x0000_i1082" style="width:0;height:1.5pt" o:hralign="center" o:hrstd="t" o:hr="t" fillcolor="#a0a0a0" stroked="f"/>
+        </w:pict>
+      </w:r>
+    </w:p>
+    <w:p>
+      <w:pPr>
+        <w:rPr>
+          <w:b/>
+          <w:bCs/>
+        </w:rPr>
+      </w:pPr>
+      <w:r>
+        <w:rPr>
+          <w:b/>
+          <w:bCs/>
+        </w:rPr>
+        <w:t>Phase 5 – Improve Customer Experience</w:t>
+      </w:r>
+    </w:p>
+    <w:p>
+      <w:r>
+        <w:t>Now that the admin can manage data, we enhance browsing.</w:t>
+      </w:r>
+    </w:p>
+    <w:p>
+      <w:pPr>
+        <w:numPr>
+          <w:ilvl w:val="0"/>
+          <w:numId w:val="35"/>
+        </w:numPr>
+      </w:pPr>
+      <w:r>
+        <w:t xml:space="preserve">Dynamic Categories </w:t>
+      </w:r>
+    </w:p>
+    <w:p>
+      <w:pPr>
+        <w:numPr>
+          <w:ilvl w:val="0"/>
+          <w:numId w:val="35"/>
+        </w:numPr>
+      </w:pPr>
+      <w:r>
+        <w:t xml:space="preserve">Menu Page </w:t>
+      </w:r>
+    </w:p>
+    <w:p>
+      <w:pPr>
+        <w:numPr>
+          <w:ilvl w:val="0"/>
+          <w:numId w:val="35"/>
+        </w:numPr>
+      </w:pPr>
+      <w:r>
+        <w:t xml:space="preserve">Search </w:t>
+      </w:r>
+    </w:p>
+    <w:p>
+      <w:pPr>
+        <w:numPr>
+          <w:ilvl w:val="0"/>
+          <w:numId w:val="35"/>
+        </w:numPr>
+      </w:pPr>
+      <w:r>
+        <w:t xml:space="preserve">Filter </w:t>
+      </w:r>
+    </w:p>
+    <w:p>
+      <w:pPr>
+        <w:numPr>
+          <w:ilvl w:val="0"/>
+          <w:numId w:val="35"/>
+        </w:numPr>
+      </w:pPr>
+      <w:r>
+        <w:t xml:space="preserve">Sort </w:t>
+      </w:r>
+    </w:p>
+    <w:p>
+      <w:pPr>
+        <w:numPr>
+          <w:ilvl w:val="0"/>
+          <w:numId w:val="35"/>
+        </w:numPr>
+      </w:pPr>
+      <w:r>
+        <w:t xml:space="preserve">Pagination </w:t>
+      </w:r>
+    </w:p>
+    <w:p>
+      <w:pPr>
+        <w:rPr>
+          <w:b/>
+          <w:bCs/>
+        </w:rPr>
+      </w:pPr>
+      <w:r>
+        <w:rPr>
+          <w:b/>
+          <w:bCs/>
+        </w:rPr>
+        <w:t>Why now?</w:t>
+      </w:r>
+    </w:p>
+    <w:p>
+      <w:r>
+        <w:t>Because Category CRUD already exists.</w:t>
+      </w:r>
+    </w:p>
+    <w:p>
+      <w:r>
+        <w:t>Instead of this:</w:t>
+      </w:r>
+    </w:p>
+    <w:p>
+      <w:r>
+        <w:t>Pizza</w:t>
+      </w:r>
+    </w:p>
+    <w:p>
+      <w:r>
+        <w:t>Burger</w:t>
+      </w:r>
+    </w:p>
+    <w:p>
+      <w:r>
+        <w:t>Drinks</w:t>
+      </w:r>
+    </w:p>
+    <w:p>
+      <w:r>
+        <w:t>hardcoded,</w:t>
+      </w:r>
+    </w:p>
+    <w:p>
+      <w:r>
+        <w:t>your Menu will fetch:</w:t>
+      </w:r>
+    </w:p>
+    <w:p>
+      <w:r>
+        <w:lastRenderedPageBreak/>
+        <w:t>GET /api/categories</w:t>
+      </w:r>
+    </w:p>
+    <w:p>
+      <w:r>
+        <w:t>from the admin-created categories.</w:t>
+      </w:r>
+    </w:p>
+    <w:p>
+      <w:r>
+        <w:rPr>
+          <w:b/>
+          <w:bCs/>
+        </w:rPr>
+        <w:t>No duplicate work.</w:t>
+      </w:r>
+    </w:p>
+    <w:p>
+      <w:r>
+        <w:pict w14:anchorId="106C4AE4">
+          <v:rect id="_x0000_i1083" style="width:0;height:1.5pt" o:hralign="center" o:hrstd="t" o:hr="t" fillcolor="#a0a0a0" stroked="f"/>
+        </w:pict>
+      </w:r>
+    </w:p>
+    <w:p>
+      <w:pPr>
+        <w:rPr>
+          <w:b/>
+          <w:bCs/>
+        </w:rPr>
+      </w:pPr>
+      <w:r>
+        <w:rPr>
+          <w:b/>
+          <w:bCs/>
+        </w:rPr>
+        <w:t>Phase 6 – Delivery Partner</w:t>
+      </w:r>
+    </w:p>
+    <w:p>
+      <w:pPr>
+        <w:numPr>
+          <w:ilvl w:val="0"/>
+          <w:numId w:val="36"/>
+        </w:numPr>
+      </w:pPr>
+      <w:r>
+        <w:t xml:space="preserve">Apply </w:t>
+      </w:r>
+    </w:p>
+    <w:p>
+      <w:pPr>
+        <w:numPr>
+          <w:ilvl w:val="0"/>
+          <w:numId w:val="36"/>
+        </w:numPr>
+      </w:pPr>
+      <w:r>
+        <w:t xml:space="preserve">Approval </w:t>
+      </w:r>
+    </w:p>
+    <w:p>
+      <w:pPr>
+        <w:numPr>
+          <w:ilvl w:val="0"/>
+          <w:numId w:val="36"/>
+        </w:numPr>
+      </w:pPr>
+      <w:r>
+        <w:t xml:space="preserve">Dashboard </w:t>
+      </w:r>
+    </w:p>
+    <w:p>
+      <w:pPr>
+        <w:numPr>
+          <w:ilvl w:val="0"/>
+          <w:numId w:val="36"/>
+        </w:numPr>
+      </w:pPr>
+      <w:r>
+        <w:t xml:space="preserve">Assigned Orders </w:t>
+      </w:r>
+    </w:p>
+    <w:p>
+      <w:pPr>
+        <w:numPr>
+          <w:ilvl w:val="0"/>
+          <w:numId w:val="36"/>
+        </w:numPr>
+      </w:pPr>
+      <w:r>
+        <w:t xml:space="preserve">Delivery Status </w:t>
+      </w:r>
+    </w:p>
+    <w:p>
+      <w:pPr>
+        <w:numPr>
+          <w:ilvl w:val="0"/>
+          <w:numId w:val="36"/>
+        </w:numPr>
+      </w:pPr>
+      <w:r>
+        <w:t xml:space="preserve">Delivery History </w:t>
+      </w:r>
+    </w:p>
+    <w:p>
+      <w:r>
+        <w:pict w14:anchorId="2581C819">
+          <v:rect id="_x0000_i1084" style="width:0;height:1.5pt" o:hralign="center" o:hrstd="t" o:hr="t" fillcolor="#a0a0a0" stroked="f"/>
+        </w:pict>
+      </w:r>
+    </w:p>
+    <w:p>
+      <w:pPr>
+        <w:rPr>
+          <w:b/>
+          <w:bCs/>
+        </w:rPr>
+      </w:pPr>
+      <w:r>
+        <w:rPr>
+          <w:b/>
+          <w:bCs/>
+        </w:rPr>
+        <w:t>Phase 7 – Final Polish</w:t>
+      </w:r>
+    </w:p>
+    <w:p>
+      <w:pPr>
+        <w:numPr>
+          <w:ilvl w:val="0"/>
+          <w:numId w:val="37"/>
+        </w:numPr>
+      </w:pPr>
+      <w:r>
+        <w:t xml:space="preserve">Image Upload (Multer) </w:t>
+      </w:r>
+    </w:p>
+    <w:p>
+      <w:pPr>
+        <w:numPr>
+          <w:ilvl w:val="0"/>
+          <w:numId w:val="37"/>
+        </w:numPr>
+      </w:pPr>
+      <w:r>
+        <w:t xml:space="preserve">Toast Notifications </w:t>
+      </w:r>
+    </w:p>
+    <w:p>
+      <w:pPr>
+        <w:numPr>
+          <w:ilvl w:val="0"/>
+          <w:numId w:val="37"/>
+        </w:numPr>
+      </w:pPr>
+      <w:r>
+        <w:t xml:space="preserve">Profile </w:t>
+      </w:r>
+    </w:p>
+    <w:p>
+      <w:pPr>
+        <w:numPr>
+          <w:ilvl w:val="0"/>
+          <w:numId w:val="37"/>
+        </w:numPr>
+      </w:pPr>
+      <w:r>
+        <w:t xml:space="preserve">Responsive improvements </w:t>
+      </w:r>
+    </w:p>
+    <w:p>
+      <w:pPr>
+        <w:numPr>
+          <w:ilvl w:val="0"/>
+          <w:numId w:val="37"/>
+        </w:numPr>
+      </w:pPr>
+      <w:r>
+        <w:t xml:space="preserve">Error Pages </w:t>
+      </w:r>
+    </w:p>
+    <w:p>
+      <w:pPr>
+        <w:numPr>
+          <w:ilvl w:val="0"/>
+          <w:numId w:val="37"/>
+        </w:numPr>
+      </w:pPr>
+      <w:r>
+        <w:t xml:space="preserve">Deployment </w:t>
+      </w:r>
+    </w:p>
+    <w:p>
+      <w:r>
+        <w:lastRenderedPageBreak/>
+        <w:drawing>
+          <wp:inline distT="0" distB="0" distL="0" distR="0" wp14:anchorId="161FD5E5" wp14:editId="7F045E19">
+            <wp:extent cx="5943600" cy="2739390"/>
+            <wp:effectExtent l="0" t="0" r="0" b="3810"/>
+            <wp:docPr id="241743211" name="Picture 1"/>
+            <wp:cNvGraphicFramePr>
+              <a:graphicFrameLocks xmlns:a="http://schemas.openxmlformats.org/drawingml/2006/main" noChangeAspect="1"/>
+            </wp:cNvGraphicFramePr>
+            <a:graphic xmlns:a="http://schemas.openxmlformats.org/drawingml/2006/main">
+              <a:graphicData uri="http://schemas.openxmlformats.org/drawingml/2006/picture">
+                <pic:pic xmlns:pic="http://schemas.openxmlformats.org/drawingml/2006/picture">
+                  <pic:nvPicPr>
+                    <pic:cNvPr id="241743211" name=""/>
+                    <pic:cNvPicPr/>
+                  </pic:nvPicPr>
+                  <pic:blipFill>
+                    <a:blip r:embed="rId5"/>
+                    <a:stretch>
+                      <a:fillRect/>
+                    </a:stretch>
+                  </pic:blipFill>
+                  <pic:spPr>
+                    <a:xfrm>
+                      <a:off x="0" y="0"/>
+                      <a:ext cx="5943600" cy="2739390"/>
+                    </a:xfrm>
+                    <a:prstGeom prst="rect">
+                      <a:avLst/>
+                    </a:prstGeom>
+                  </pic:spPr>
+                </pic:pic>
+              </a:graphicData>
+            </a:graphic>
+          </wp:inline>
+        </w:drawing>
+      </w:r>
+    </w:p>
     <w:sectPr>
       <w:pgSz w:w="12240" w:h="15840"/>
       <w:pgMar w:top="1440" w:right="1440" w:bottom="1440" w:left="1440" w:header="720" w:footer="720" w:gutter="0"/>
@@ -4252,6 +4955,155 @@
 <file path=word/numbering.xml><?xml version="1.0" encoding="utf-8"?>
 <w:numbering xmlns:wpc="http://schemas.microsoft.com/office/word/2010/wordprocessingCanvas" xmlns:cx="http://schemas.microsoft.com/office/drawing/2014/chartex" xmlns:cx1="http://schemas.microsoft.com/office/drawing/2015/9/8/chartex" xmlns:cx2="http://schemas.microsoft.com/office/drawing/2015/10/21/chartex" xmlns:cx3="http://schemas.microsoft.com/office/drawing/2016/5/9/chartex" xmlns:cx4="http://schemas.microsoft.com/office/drawing/2016/5/10/chartex" xmlns:cx5="http://schemas.microsoft.com/office/drawing/2016/5/11/chartex" xmlns:cx6="http://schemas.microsoft.com/office/drawing/2016/5/12/chartex" xmlns:cx7="http://schemas.microsoft.com/office/drawing/2016/5/13/chartex" xmlns:cx8="http://schemas.microsoft.com/office/drawing/2016/5/14/chartex" xmlns:mc="http://schemas.openxmlformats.org/markup-compatibility/2006" xmlns:aink="http://schemas.microsoft.com/office/drawing/2016/ink" xmlns:am3d="http://schemas.microsoft.com/office/drawing/2017/model3d" xmlns:o="urn:schemas-microsoft-com:office:office" xmlns:oel="http://schemas.microsoft.com/office/2019/extlst" xmlns:r="http://schemas.openxmlformats.org/officeDocument/2006/relationships" xmlns:m="http://schemas.openxmlformats.org/officeDocument/2006/math" xmlns:v="urn:schemas-microsoft-com:vml" xmlns:wp14="http://schemas.microsoft.com/office/word/2010/wordprocessingDrawing" xmlns:wp="http://schemas.openxmlformats.org/drawingml/2006/wordprocessingDrawing" xmlns:w10="urn:schemas-microsoft-com:office:word" xmlns:w="http://schemas.openxmlformats.org/wordprocessingml/2006/main" xmlns:w14="http://schemas.microsoft.com/office/word/2010/wordml" xmlns:w15="http://schemas.microsoft.com/office/word/2012/wordml" xmlns:w16cex="http://schemas.microsoft.com/office/word/2018/wordml/cex" xmlns:w16cid="http://schemas.microsoft.com/office/word/2016/wordml/cid" xmlns:w16="http://schemas.microsoft.com/office/word/2018/wordml" xmlns:w16du="http://schemas.microsoft.com/office/word/2023/wordml/word16du" xmlns:w16sdtdh="http://schemas.microsoft.com/office/word/2020/wordml/sdtdatahash" xmlns:w16sdtfl="http://schemas.microsoft.com/office/word/2024/wordml/sdtformatlock" xmlns:w16se="http://schemas.microsoft.com/office/word/2015/wordml/symex" xmlns:wpg="http://schemas.microsoft.com/office/word/2010/wordprocessingGroup" xmlns:wpi="http://schemas.microsoft.com/office/word/2010/wordprocessingInk" xmlns:wne="http://schemas.microsoft.com/office/word/2006/wordml" xmlns:wps="http://schemas.microsoft.com/office/word/2010/wordprocessingShape" mc:Ignorable="w14 w15 w16se w16cid w16 w16cex w16sdtdh w16sdtfl w16du wp14">
   <w:abstractNum w:abstractNumId="0" w15:restartNumberingAfterBreak="0">
+    <w:nsid w:val="0040501B"/>
+    <w:multiLevelType w:val="multilevel"/>
+    <w:tmpl w:val="D8CEFED2"/>
+    <w:lvl w:ilvl="0">
+      <w:start w:val="1"/>
+      <w:numFmt w:val="bullet"/>
+      <w:lvlText w:val=""/>
+      <w:lvlJc w:val="left"/>
+      <w:pPr>
+        <w:tabs>
+          <w:tab w:val="num" w:pos="720"/>
+        </w:tabs>
+        <w:ind w:left="720" w:hanging="360"/>
+      </w:pPr>
+      <w:rPr>
+        <w:rFonts w:ascii="Symbol" w:hAnsi="Symbol" w:hint="default"/>
+        <w:sz w:val="20"/>
+      </w:rPr>
+    </w:lvl>
+    <w:lvl w:ilvl="1" w:tentative="1">
+      <w:start w:val="1"/>
+      <w:numFmt w:val="bullet"/>
+      <w:lvlText w:val="o"/>
+      <w:lvlJc w:val="left"/>
+      <w:pPr>
+        <w:tabs>
+          <w:tab w:val="num" w:pos="1440"/>
+        </w:tabs>
+        <w:ind w:left="1440" w:hanging="360"/>
+      </w:pPr>
+      <w:rPr>
+        <w:rFonts w:ascii="Courier New" w:hAnsi="Courier New" w:hint="default"/>
+        <w:sz w:val="20"/>
+      </w:rPr>
+    </w:lvl>
+    <w:lvl w:ilvl="2" w:tentative="1">
+      <w:start w:val="1"/>
+      <w:numFmt w:val="bullet"/>
+      <w:lvlText w:val=""/>
+      <w:lvlJc w:val="left"/>
+      <w:pPr>
+        <w:tabs>
+          <w:tab w:val="num" w:pos="2160"/>
+        </w:tabs>
+        <w:ind w:left="2160" w:hanging="360"/>
+      </w:pPr>
+      <w:rPr>
+        <w:rFonts w:ascii="Wingdings" w:hAnsi="Wingdings" w:hint="default"/>
+        <w:sz w:val="20"/>
+      </w:rPr>
+    </w:lvl>
+    <w:lvl w:ilvl="3" w:tentative="1">
+      <w:start w:val="1"/>
+      <w:numFmt w:val="bullet"/>
+      <w:lvlText w:val=""/>
+      <w:lvlJc w:val="left"/>
+      <w:pPr>
+        <w:tabs>
+          <w:tab w:val="num" w:pos="2880"/>
+        </w:tabs>
+        <w:ind w:left="2880" w:hanging="360"/>
+      </w:pPr>
+      <w:rPr>
+        <w:rFonts w:ascii="Wingdings" w:hAnsi="Wingdings" w:hint="default"/>
+        <w:sz w:val="20"/>
+      </w:rPr>
+    </w:lvl>
+    <w:lvl w:ilvl="4" w:tentative="1">
+      <w:start w:val="1"/>
+      <w:numFmt w:val="bullet"/>
+      <w:lvlText w:val=""/>
+      <w:lvlJc w:val="left"/>
+      <w:pPr>
+        <w:tabs>
+          <w:tab w:val="num" w:pos="3600"/>
+        </w:tabs>
+        <w:ind w:left="3600" w:hanging="360"/>
+      </w:pPr>
+      <w:rPr>
+        <w:rFonts w:ascii="Wingdings" w:hAnsi="Wingdings" w:hint="default"/>
+        <w:sz w:val="20"/>
+      </w:rPr>
+    </w:lvl>
+    <w:lvl w:ilvl="5" w:tentative="1">
+      <w:start w:val="1"/>
+      <w:numFmt w:val="bullet"/>
+      <w:lvlText w:val=""/>
+      <w:lvlJc w:val="left"/>
+      <w:pPr>
+        <w:tabs>
+          <w:tab w:val="num" w:pos="4320"/>
+        </w:tabs>
+        <w:ind w:left="4320" w:hanging="360"/>
+      </w:pPr>
+      <w:rPr>
+        <w:rFonts w:ascii="Wingdings" w:hAnsi="Wingdings" w:hint="default"/>
+        <w:sz w:val="20"/>
+      </w:rPr>
+    </w:lvl>
+    <w:lvl w:ilvl="6" w:tentative="1">
+      <w:start w:val="1"/>
+      <w:numFmt w:val="bullet"/>
+      <w:lvlText w:val=""/>
+      <w:lvlJc w:val="left"/>
+      <w:pPr>
+        <w:tabs>
+          <w:tab w:val="num" w:pos="5040"/>
+        </w:tabs>
+        <w:ind w:left="5040" w:hanging="360"/>
+      </w:pPr>
+      <w:rPr>
+        <w:rFonts w:ascii="Wingdings" w:hAnsi="Wingdings" w:hint="default"/>
+        <w:sz w:val="20"/>
+      </w:rPr>
+    </w:lvl>
+    <w:lvl w:ilvl="7" w:tentative="1">
+      <w:start w:val="1"/>
+      <w:numFmt w:val="bullet"/>
+      <w:lvlText w:val=""/>
+      <w:lvlJc w:val="left"/>
+      <w:pPr>
+        <w:tabs>
+          <w:tab w:val="num" w:pos="5760"/>
+        </w:tabs>
+        <w:ind w:left="5760" w:hanging="360"/>
+      </w:pPr>
+      <w:rPr>
+        <w:rFonts w:ascii="Wingdings" w:hAnsi="Wingdings" w:hint="default"/>
+        <w:sz w:val="20"/>
+      </w:rPr>
+    </w:lvl>
+    <w:lvl w:ilvl="8" w:tentative="1">
+      <w:start w:val="1"/>
+      <w:numFmt w:val="bullet"/>
+      <w:lvlText w:val=""/>
+      <w:lvlJc w:val="left"/>
+      <w:pPr>
+        <w:tabs>
+          <w:tab w:val="num" w:pos="6480"/>
+        </w:tabs>
+        <w:ind w:left="6480" w:hanging="360"/>
+      </w:pPr>
+      <w:rPr>
+        <w:rFonts w:ascii="Wingdings" w:hAnsi="Wingdings" w:hint="default"/>
+        <w:sz w:val="20"/>
+      </w:rPr>
+    </w:lvl>
+  </w:abstractNum>
+  <w:abstractNum w:abstractNumId="1" w15:restartNumberingAfterBreak="0">
     <w:nsid w:val="00BA1D76"/>
     <w:multiLevelType w:val="multilevel"/>
     <w:tmpl w:val="E436AC5E"/>
@@ -4400,7 +5252,7 @@
       </w:rPr>
     </w:lvl>
   </w:abstractNum>
-  <w:abstractNum w:abstractNumId="1" w15:restartNumberingAfterBreak="0">
+  <w:abstractNum w:abstractNumId="2" w15:restartNumberingAfterBreak="0">
     <w:nsid w:val="02F52178"/>
     <w:multiLevelType w:val="multilevel"/>
     <w:tmpl w:val="6D2824B0"/>
@@ -4549,7 +5401,7 @@
       </w:rPr>
     </w:lvl>
   </w:abstractNum>
-  <w:abstractNum w:abstractNumId="2" w15:restartNumberingAfterBreak="0">
+  <w:abstractNum w:abstractNumId="3" w15:restartNumberingAfterBreak="0">
     <w:nsid w:val="03230D5A"/>
     <w:multiLevelType w:val="multilevel"/>
     <w:tmpl w:val="B1A82650"/>
@@ -4698,7 +5550,156 @@
       </w:rPr>
     </w:lvl>
   </w:abstractNum>
-  <w:abstractNum w:abstractNumId="3" w15:restartNumberingAfterBreak="0">
+  <w:abstractNum w:abstractNumId="4" w15:restartNumberingAfterBreak="0">
+    <w:nsid w:val="06911CEA"/>
+    <w:multiLevelType w:val="multilevel"/>
+    <w:tmpl w:val="0CC8D284"/>
+    <w:lvl w:ilvl="0">
+      <w:start w:val="1"/>
+      <w:numFmt w:val="bullet"/>
+      <w:lvlText w:val=""/>
+      <w:lvlJc w:val="left"/>
+      <w:pPr>
+        <w:tabs>
+          <w:tab w:val="num" w:pos="720"/>
+        </w:tabs>
+        <w:ind w:left="720" w:hanging="360"/>
+      </w:pPr>
+      <w:rPr>
+        <w:rFonts w:ascii="Symbol" w:hAnsi="Symbol" w:hint="default"/>
+        <w:sz w:val="20"/>
+      </w:rPr>
+    </w:lvl>
+    <w:lvl w:ilvl="1" w:tentative="1">
+      <w:start w:val="1"/>
+      <w:numFmt w:val="bullet"/>
+      <w:lvlText w:val="o"/>
+      <w:lvlJc w:val="left"/>
+      <w:pPr>
+        <w:tabs>
+          <w:tab w:val="num" w:pos="1440"/>
+        </w:tabs>
+        <w:ind w:left="1440" w:hanging="360"/>
+      </w:pPr>
+      <w:rPr>
+        <w:rFonts w:ascii="Courier New" w:hAnsi="Courier New" w:hint="default"/>
+        <w:sz w:val="20"/>
+      </w:rPr>
+    </w:lvl>
+    <w:lvl w:ilvl="2" w:tentative="1">
+      <w:start w:val="1"/>
+      <w:numFmt w:val="bullet"/>
+      <w:lvlText w:val=""/>
+      <w:lvlJc w:val="left"/>
+      <w:pPr>
+        <w:tabs>
+          <w:tab w:val="num" w:pos="2160"/>
+        </w:tabs>
+        <w:ind w:left="2160" w:hanging="360"/>
+      </w:pPr>
+      <w:rPr>
+        <w:rFonts w:ascii="Wingdings" w:hAnsi="Wingdings" w:hint="default"/>
+        <w:sz w:val="20"/>
+      </w:rPr>
+    </w:lvl>
+    <w:lvl w:ilvl="3" w:tentative="1">
+      <w:start w:val="1"/>
+      <w:numFmt w:val="bullet"/>
+      <w:lvlText w:val=""/>
+      <w:lvlJc w:val="left"/>
+      <w:pPr>
+        <w:tabs>
+          <w:tab w:val="num" w:pos="2880"/>
+        </w:tabs>
+        <w:ind w:left="2880" w:hanging="360"/>
+      </w:pPr>
+      <w:rPr>
+        <w:rFonts w:ascii="Wingdings" w:hAnsi="Wingdings" w:hint="default"/>
+        <w:sz w:val="20"/>
+      </w:rPr>
+    </w:lvl>
+    <w:lvl w:ilvl="4" w:tentative="1">
+      <w:start w:val="1"/>
+      <w:numFmt w:val="bullet"/>
+      <w:lvlText w:val=""/>
+      <w:lvlJc w:val="left"/>
+      <w:pPr>
+        <w:tabs>
+          <w:tab w:val="num" w:pos="3600"/>
+        </w:tabs>
+        <w:ind w:left="3600" w:hanging="360"/>
+      </w:pPr>
+      <w:rPr>
+        <w:rFonts w:ascii="Wingdings" w:hAnsi="Wingdings" w:hint="default"/>
+        <w:sz w:val="20"/>
+      </w:rPr>
+    </w:lvl>
+    <w:lvl w:ilvl="5" w:tentative="1">
+      <w:start w:val="1"/>
+      <w:numFmt w:val="bullet"/>
+      <w:lvlText w:val=""/>
+      <w:lvlJc w:val="left"/>
+      <w:pPr>
+        <w:tabs>
+          <w:tab w:val="num" w:pos="4320"/>
+        </w:tabs>
+        <w:ind w:left="4320" w:hanging="360"/>
+      </w:pPr>
+      <w:rPr>
+        <w:rFonts w:ascii="Wingdings" w:hAnsi="Wingdings" w:hint="default"/>
+        <w:sz w:val="20"/>
+      </w:rPr>
+    </w:lvl>
+    <w:lvl w:ilvl="6" w:tentative="1">
+      <w:start w:val="1"/>
+      <w:numFmt w:val="bullet"/>
+      <w:lvlText w:val=""/>
+      <w:lvlJc w:val="left"/>
+      <w:pPr>
+        <w:tabs>
+          <w:tab w:val="num" w:pos="5040"/>
+        </w:tabs>
+        <w:ind w:left="5040" w:hanging="360"/>
+      </w:pPr>
+      <w:rPr>
+        <w:rFonts w:ascii="Wingdings" w:hAnsi="Wingdings" w:hint="default"/>
+        <w:sz w:val="20"/>
+      </w:rPr>
+    </w:lvl>
+    <w:lvl w:ilvl="7" w:tentative="1">
+      <w:start w:val="1"/>
+      <w:numFmt w:val="bullet"/>
+      <w:lvlText w:val=""/>
+      <w:lvlJc w:val="left"/>
+      <w:pPr>
+        <w:tabs>
+          <w:tab w:val="num" w:pos="5760"/>
+        </w:tabs>
+        <w:ind w:left="5760" w:hanging="360"/>
+      </w:pPr>
+      <w:rPr>
+        <w:rFonts w:ascii="Wingdings" w:hAnsi="Wingdings" w:hint="default"/>
+        <w:sz w:val="20"/>
+      </w:rPr>
+    </w:lvl>
+    <w:lvl w:ilvl="8" w:tentative="1">
+      <w:start w:val="1"/>
+      <w:numFmt w:val="bullet"/>
+      <w:lvlText w:val=""/>
+      <w:lvlJc w:val="left"/>
+      <w:pPr>
+        <w:tabs>
+          <w:tab w:val="num" w:pos="6480"/>
+        </w:tabs>
+        <w:ind w:left="6480" w:hanging="360"/>
+      </w:pPr>
+      <w:rPr>
+        <w:rFonts w:ascii="Wingdings" w:hAnsi="Wingdings" w:hint="default"/>
+        <w:sz w:val="20"/>
+      </w:rPr>
+    </w:lvl>
+  </w:abstractNum>
+  <w:abstractNum w:abstractNumId="5" w15:restartNumberingAfterBreak="0">
     <w:nsid w:val="0B6E2F6B"/>
     <w:multiLevelType w:val="multilevel"/>
     <w:tmpl w:val="BDCE0FAE"/>
@@ -4847,7 +5848,7 @@
       </w:rPr>
     </w:lvl>
   </w:abstractNum>
-  <w:abstractNum w:abstractNumId="4" w15:restartNumberingAfterBreak="0">
+  <w:abstractNum w:abstractNumId="6" w15:restartNumberingAfterBreak="0">
     <w:nsid w:val="122B3586"/>
     <w:multiLevelType w:val="multilevel"/>
     <w:tmpl w:val="175686BE"/>
@@ -4996,7 +5997,7 @@
       </w:rPr>
     </w:lvl>
   </w:abstractNum>
-  <w:abstractNum w:abstractNumId="5" w15:restartNumberingAfterBreak="0">
+  <w:abstractNum w:abstractNumId="7" w15:restartNumberingAfterBreak="0">
     <w:nsid w:val="139979EC"/>
     <w:multiLevelType w:val="multilevel"/>
     <w:tmpl w:val="6C489924"/>
@@ -5145,7 +6146,7 @@
       </w:rPr>
     </w:lvl>
   </w:abstractNum>
-  <w:abstractNum w:abstractNumId="6" w15:restartNumberingAfterBreak="0">
+  <w:abstractNum w:abstractNumId="8" w15:restartNumberingAfterBreak="0">
     <w:nsid w:val="251A087C"/>
     <w:multiLevelType w:val="multilevel"/>
     <w:tmpl w:val="7DD01818"/>
@@ -5294,7 +6295,7 @@
       </w:rPr>
     </w:lvl>
   </w:abstractNum>
-  <w:abstractNum w:abstractNumId="7" w15:restartNumberingAfterBreak="0">
+  <w:abstractNum w:abstractNumId="9" w15:restartNumberingAfterBreak="0">
     <w:nsid w:val="259869C0"/>
     <w:multiLevelType w:val="multilevel"/>
     <w:tmpl w:val="9500A72E"/>
@@ -5443,7 +6444,7 @@
       </w:rPr>
     </w:lvl>
   </w:abstractNum>
-  <w:abstractNum w:abstractNumId="8" w15:restartNumberingAfterBreak="0">
+  <w:abstractNum w:abstractNumId="10" w15:restartNumberingAfterBreak="0">
     <w:nsid w:val="34CA5A6C"/>
     <w:multiLevelType w:val="multilevel"/>
     <w:tmpl w:val="52EA5A34"/>
@@ -5592,7 +6593,7 @@
       </w:rPr>
     </w:lvl>
   </w:abstractNum>
-  <w:abstractNum w:abstractNumId="9" w15:restartNumberingAfterBreak="0">
+  <w:abstractNum w:abstractNumId="11" w15:restartNumberingAfterBreak="0">
     <w:nsid w:val="37CF3C75"/>
     <w:multiLevelType w:val="multilevel"/>
     <w:tmpl w:val="0CA6AE06"/>
@@ -5741,7 +6742,7 @@
       </w:rPr>
     </w:lvl>
   </w:abstractNum>
-  <w:abstractNum w:abstractNumId="10" w15:restartNumberingAfterBreak="0">
+  <w:abstractNum w:abstractNumId="12" w15:restartNumberingAfterBreak="0">
     <w:nsid w:val="38AF4DA3"/>
     <w:multiLevelType w:val="multilevel"/>
     <w:tmpl w:val="68E81C66"/>
@@ -5890,7 +6891,7 @@
       </w:rPr>
     </w:lvl>
   </w:abstractNum>
-  <w:abstractNum w:abstractNumId="11" w15:restartNumberingAfterBreak="0">
+  <w:abstractNum w:abstractNumId="13" w15:restartNumberingAfterBreak="0">
     <w:nsid w:val="3B254580"/>
     <w:multiLevelType w:val="multilevel"/>
     <w:tmpl w:val="23364070"/>
@@ -6039,7 +7040,7 @@
       </w:rPr>
     </w:lvl>
   </w:abstractNum>
-  <w:abstractNum w:abstractNumId="12" w15:restartNumberingAfterBreak="0">
+  <w:abstractNum w:abstractNumId="14" w15:restartNumberingAfterBreak="0">
     <w:nsid w:val="3B2D6855"/>
     <w:multiLevelType w:val="multilevel"/>
     <w:tmpl w:val="A6E67146"/>
@@ -6188,7 +7189,7 @@
       </w:rPr>
     </w:lvl>
   </w:abstractNum>
-  <w:abstractNum w:abstractNumId="13" w15:restartNumberingAfterBreak="0">
+  <w:abstractNum w:abstractNumId="15" w15:restartNumberingAfterBreak="0">
     <w:nsid w:val="3BBD061D"/>
     <w:multiLevelType w:val="multilevel"/>
     <w:tmpl w:val="4D10B6BE"/>
@@ -6337,7 +7338,7 @@
       </w:rPr>
     </w:lvl>
   </w:abstractNum>
-  <w:abstractNum w:abstractNumId="14" w15:restartNumberingAfterBreak="0">
+  <w:abstractNum w:abstractNumId="16" w15:restartNumberingAfterBreak="0">
     <w:nsid w:val="3E0B6D9D"/>
     <w:multiLevelType w:val="multilevel"/>
     <w:tmpl w:val="D86C35A0"/>
@@ -6486,7 +7487,418 @@
       </w:rPr>
     </w:lvl>
   </w:abstractNum>
-  <w:abstractNum w:abstractNumId="15" w15:restartNumberingAfterBreak="0">
+  <w:abstractNum w:abstractNumId="17" w15:restartNumberingAfterBreak="0">
+    <w:nsid w:val="3E336F93"/>
+    <w:multiLevelType w:val="multilevel"/>
+    <w:tmpl w:val="4ED22FB4"/>
+    <w:lvl w:ilvl="0">
+      <w:start w:val="1"/>
+      <w:numFmt w:val="decimal"/>
+      <w:lvlText w:val="%1."/>
+      <w:lvlJc w:val="left"/>
+      <w:pPr>
+        <w:tabs>
+          <w:tab w:val="num" w:pos="720"/>
+        </w:tabs>
+        <w:ind w:left="720" w:hanging="360"/>
+      </w:pPr>
+    </w:lvl>
+    <w:lvl w:ilvl="1" w:tentative="1">
+      <w:start w:val="1"/>
+      <w:numFmt w:val="decimal"/>
+      <w:lvlText w:val="%2."/>
+      <w:lvlJc w:val="left"/>
+      <w:pPr>
+        <w:tabs>
+          <w:tab w:val="num" w:pos="1440"/>
+        </w:tabs>
+        <w:ind w:left="1440" w:hanging="360"/>
+      </w:pPr>
+    </w:lvl>
+    <w:lvl w:ilvl="2" w:tentative="1">
+      <w:start w:val="1"/>
+      <w:numFmt w:val="decimal"/>
+      <w:lvlText w:val="%3."/>
+      <w:lvlJc w:val="left"/>
+      <w:pPr>
+        <w:tabs>
+          <w:tab w:val="num" w:pos="2160"/>
+        </w:tabs>
+        <w:ind w:left="2160" w:hanging="360"/>
+      </w:pPr>
+    </w:lvl>
+    <w:lvl w:ilvl="3" w:tentative="1">
+      <w:start w:val="1"/>
+      <w:numFmt w:val="decimal"/>
+      <w:lvlText w:val="%4."/>
+      <w:lvlJc w:val="left"/>
+      <w:pPr>
+        <w:tabs>
+          <w:tab w:val="num" w:pos="2880"/>
+        </w:tabs>
+        <w:ind w:left="2880" w:hanging="360"/>
+      </w:pPr>
+    </w:lvl>
+    <w:lvl w:ilvl="4" w:tentative="1">
+      <w:start w:val="1"/>
+      <w:numFmt w:val="decimal"/>
+      <w:lvlText w:val="%5."/>
+      <w:lvlJc w:val="left"/>
+      <w:pPr>
+        <w:tabs>
+          <w:tab w:val="num" w:pos="3600"/>
+        </w:tabs>
+        <w:ind w:left="3600" w:hanging="360"/>
+      </w:pPr>
+    </w:lvl>
+    <w:lvl w:ilvl="5" w:tentative="1">
+      <w:start w:val="1"/>
+      <w:numFmt w:val="decimal"/>
+      <w:lvlText w:val="%6."/>
+      <w:lvlJc w:val="left"/>
+      <w:pPr>
+        <w:tabs>
+          <w:tab w:val="num" w:pos="4320"/>
+        </w:tabs>
+        <w:ind w:left="4320" w:hanging="360"/>
+      </w:pPr>
+    </w:lvl>
+    <w:lvl w:ilvl="6" w:tentative="1">
+      <w:start w:val="1"/>
+      <w:numFmt w:val="decimal"/>
+      <w:lvlText w:val="%7."/>
+      <w:lvlJc w:val="left"/>
+      <w:pPr>
+        <w:tabs>
+          <w:tab w:val="num" w:pos="5040"/>
+        </w:tabs>
+        <w:ind w:left="5040" w:hanging="360"/>
+      </w:pPr>
+    </w:lvl>
+    <w:lvl w:ilvl="7" w:tentative="1">
+      <w:start w:val="1"/>
+      <w:numFmt w:val="decimal"/>
+      <w:lvlText w:val="%8."/>
+      <w:lvlJc w:val="left"/>
+      <w:pPr>
+        <w:tabs>
+          <w:tab w:val="num" w:pos="5760"/>
+        </w:tabs>
+        <w:ind w:left="5760" w:hanging="360"/>
+      </w:pPr>
+    </w:lvl>
+    <w:lvl w:ilvl="8" w:tentative="1">
+      <w:start w:val="1"/>
+      <w:numFmt w:val="decimal"/>
+      <w:lvlText w:val="%9."/>
+      <w:lvlJc w:val="left"/>
+      <w:pPr>
+        <w:tabs>
+          <w:tab w:val="num" w:pos="6480"/>
+        </w:tabs>
+        <w:ind w:left="6480" w:hanging="360"/>
+      </w:pPr>
+    </w:lvl>
+  </w:abstractNum>
+  <w:abstractNum w:abstractNumId="18" w15:restartNumberingAfterBreak="0">
+    <w:nsid w:val="408B655B"/>
+    <w:multiLevelType w:val="multilevel"/>
+    <w:tmpl w:val="37029CE4"/>
+    <w:lvl w:ilvl="0">
+      <w:start w:val="1"/>
+      <w:numFmt w:val="bullet"/>
+      <w:lvlText w:val=""/>
+      <w:lvlJc w:val="left"/>
+      <w:pPr>
+        <w:tabs>
+          <w:tab w:val="num" w:pos="720"/>
+        </w:tabs>
+        <w:ind w:left="720" w:hanging="360"/>
+      </w:pPr>
+      <w:rPr>
+        <w:rFonts w:ascii="Symbol" w:hAnsi="Symbol" w:hint="default"/>
+        <w:sz w:val="20"/>
+      </w:rPr>
+    </w:lvl>
+    <w:lvl w:ilvl="1" w:tentative="1">
+      <w:start w:val="1"/>
+      <w:numFmt w:val="bullet"/>
+      <w:lvlText w:val="o"/>
+      <w:lvlJc w:val="left"/>
+      <w:pPr>
+        <w:tabs>
+          <w:tab w:val="num" w:pos="1440"/>
+        </w:tabs>
+        <w:ind w:left="1440" w:hanging="360"/>
+      </w:pPr>
+      <w:rPr>
+        <w:rFonts w:ascii="Courier New" w:hAnsi="Courier New" w:hint="default"/>
+        <w:sz w:val="20"/>
+      </w:rPr>
+    </w:lvl>
+    <w:lvl w:ilvl="2" w:tentative="1">
+      <w:start w:val="1"/>
+      <w:numFmt w:val="bullet"/>
+      <w:lvlText w:val=""/>
+      <w:lvlJc w:val="left"/>
+      <w:pPr>
+        <w:tabs>
+          <w:tab w:val="num" w:pos="2160"/>
+        </w:tabs>
+        <w:ind w:left="2160" w:hanging="360"/>
+      </w:pPr>
+      <w:rPr>
+        <w:rFonts w:ascii="Wingdings" w:hAnsi="Wingdings" w:hint="default"/>
+        <w:sz w:val="20"/>
+      </w:rPr>
+    </w:lvl>
+    <w:lvl w:ilvl="3" w:tentative="1">
+      <w:start w:val="1"/>
+      <w:numFmt w:val="bullet"/>
+      <w:lvlText w:val=""/>
+      <w:lvlJc w:val="left"/>
+      <w:pPr>
+        <w:tabs>
+          <w:tab w:val="num" w:pos="2880"/>
+        </w:tabs>
+        <w:ind w:left="2880" w:hanging="360"/>
+      </w:pPr>
+      <w:rPr>
+        <w:rFonts w:ascii="Wingdings" w:hAnsi="Wingdings" w:hint="default"/>
+        <w:sz w:val="20"/>
+      </w:rPr>
+    </w:lvl>
+    <w:lvl w:ilvl="4" w:tentative="1">
+      <w:start w:val="1"/>
+      <w:numFmt w:val="bullet"/>
+      <w:lvlText w:val=""/>
+      <w:lvlJc w:val="left"/>
+      <w:pPr>
+        <w:tabs>
+          <w:tab w:val="num" w:pos="3600"/>
+        </w:tabs>
+        <w:ind w:left="3600" w:hanging="360"/>
+      </w:pPr>
+      <w:rPr>
+        <w:rFonts w:ascii="Wingdings" w:hAnsi="Wingdings" w:hint="default"/>
+        <w:sz w:val="20"/>
+      </w:rPr>
+    </w:lvl>
+    <w:lvl w:ilvl="5" w:tentative="1">
+      <w:start w:val="1"/>
+      <w:numFmt w:val="bullet"/>
+      <w:lvlText w:val=""/>
+      <w:lvlJc w:val="left"/>
+      <w:pPr>
+        <w:tabs>
+          <w:tab w:val="num" w:pos="4320"/>
+        </w:tabs>
+        <w:ind w:left="4320" w:hanging="360"/>
+      </w:pPr>
+      <w:rPr>
+        <w:rFonts w:ascii="Wingdings" w:hAnsi="Wingdings" w:hint="default"/>
+        <w:sz w:val="20"/>
+      </w:rPr>
+    </w:lvl>
+    <w:lvl w:ilvl="6" w:tentative="1">
+      <w:start w:val="1"/>
+      <w:numFmt w:val="bullet"/>
+      <w:lvlText w:val=""/>
+      <w:lvlJc w:val="left"/>
+      <w:pPr>
+        <w:tabs>
+          <w:tab w:val="num" w:pos="5040"/>
+        </w:tabs>
+        <w:ind w:left="5040" w:hanging="360"/>
+      </w:pPr>
+      <w:rPr>
+        <w:rFonts w:ascii="Wingdings" w:hAnsi="Wingdings" w:hint="default"/>
+        <w:sz w:val="20"/>
+      </w:rPr>
+    </w:lvl>
+    <w:lvl w:ilvl="7" w:tentative="1">
+      <w:start w:val="1"/>
+      <w:numFmt w:val="bullet"/>
+      <w:lvlText w:val=""/>
+      <w:lvlJc w:val="left"/>
+      <w:pPr>
+        <w:tabs>
+          <w:tab w:val="num" w:pos="5760"/>
+        </w:tabs>
+        <w:ind w:left="5760" w:hanging="360"/>
+      </w:pPr>
+      <w:rPr>
+        <w:rFonts w:ascii="Wingdings" w:hAnsi="Wingdings" w:hint="default"/>
+        <w:sz w:val="20"/>
+      </w:rPr>
+    </w:lvl>
+    <w:lvl w:ilvl="8" w:tentative="1">
+      <w:start w:val="1"/>
+      <w:numFmt w:val="bullet"/>
+      <w:lvlText w:val=""/>
+      <w:lvlJc w:val="left"/>
+      <w:pPr>
+        <w:tabs>
+          <w:tab w:val="num" w:pos="6480"/>
+        </w:tabs>
+        <w:ind w:left="6480" w:hanging="360"/>
+      </w:pPr>
+      <w:rPr>
+        <w:rFonts w:ascii="Wingdings" w:hAnsi="Wingdings" w:hint="default"/>
+        <w:sz w:val="20"/>
+      </w:rPr>
+    </w:lvl>
+  </w:abstractNum>
+  <w:abstractNum w:abstractNumId="19" w15:restartNumberingAfterBreak="0">
+    <w:nsid w:val="40FD615B"/>
+    <w:multiLevelType w:val="multilevel"/>
+    <w:tmpl w:val="76E821E0"/>
+    <w:lvl w:ilvl="0">
+      <w:start w:val="1"/>
+      <w:numFmt w:val="bullet"/>
+      <w:lvlText w:val=""/>
+      <w:lvlJc w:val="left"/>
+      <w:pPr>
+        <w:tabs>
+          <w:tab w:val="num" w:pos="720"/>
+        </w:tabs>
+        <w:ind w:left="720" w:hanging="360"/>
+      </w:pPr>
+      <w:rPr>
+        <w:rFonts w:ascii="Symbol" w:hAnsi="Symbol" w:hint="default"/>
+        <w:sz w:val="20"/>
+      </w:rPr>
+    </w:lvl>
+    <w:lvl w:ilvl="1" w:tentative="1">
+      <w:start w:val="1"/>
+      <w:numFmt w:val="bullet"/>
+      <w:lvlText w:val="o"/>
+      <w:lvlJc w:val="left"/>
+      <w:pPr>
+        <w:tabs>
+          <w:tab w:val="num" w:pos="1440"/>
+        </w:tabs>
+        <w:ind w:left="1440" w:hanging="360"/>
+      </w:pPr>
+      <w:rPr>
+        <w:rFonts w:ascii="Courier New" w:hAnsi="Courier New" w:hint="default"/>
+        <w:sz w:val="20"/>
+      </w:rPr>
+    </w:lvl>
+    <w:lvl w:ilvl="2" w:tentative="1">
+      <w:start w:val="1"/>
+      <w:numFmt w:val="bullet"/>
+      <w:lvlText w:val=""/>
+      <w:lvlJc w:val="left"/>
+      <w:pPr>
+        <w:tabs>
+          <w:tab w:val="num" w:pos="2160"/>
+        </w:tabs>
+        <w:ind w:left="2160" w:hanging="360"/>
+      </w:pPr>
+      <w:rPr>
+        <w:rFonts w:ascii="Wingdings" w:hAnsi="Wingdings" w:hint="default"/>
+        <w:sz w:val="20"/>
+      </w:rPr>
+    </w:lvl>
+    <w:lvl w:ilvl="3" w:tentative="1">
+      <w:start w:val="1"/>
+      <w:numFmt w:val="bullet"/>
+      <w:lvlText w:val=""/>
+      <w:lvlJc w:val="left"/>
+      <w:pPr>
+        <w:tabs>
+          <w:tab w:val="num" w:pos="2880"/>
+        </w:tabs>
+        <w:ind w:left="2880" w:hanging="360"/>
+      </w:pPr>
+      <w:rPr>
+        <w:rFonts w:ascii="Wingdings" w:hAnsi="Wingdings" w:hint="default"/>
+        <w:sz w:val="20"/>
+      </w:rPr>
+    </w:lvl>
+    <w:lvl w:ilvl="4" w:tentative="1">
+      <w:start w:val="1"/>
+      <w:numFmt w:val="bullet"/>
+      <w:lvlText w:val=""/>
+      <w:lvlJc w:val="left"/>
+      <w:pPr>
+        <w:tabs>
+          <w:tab w:val="num" w:pos="3600"/>
+        </w:tabs>
+        <w:ind w:left="3600" w:hanging="360"/>
+      </w:pPr>
+      <w:rPr>
+        <w:rFonts w:ascii="Wingdings" w:hAnsi="Wingdings" w:hint="default"/>
+        <w:sz w:val="20"/>
+      </w:rPr>
+    </w:lvl>
+    <w:lvl w:ilvl="5" w:tentative="1">
+      <w:start w:val="1"/>
+      <w:numFmt w:val="bullet"/>
+      <w:lvlText w:val=""/>
+      <w:lvlJc w:val="left"/>
+      <w:pPr>
+        <w:tabs>
+          <w:tab w:val="num" w:pos="4320"/>
+        </w:tabs>
+        <w:ind w:left="4320" w:hanging="360"/>
+      </w:pPr>
+      <w:rPr>
+        <w:rFonts w:ascii="Wingdings" w:hAnsi="Wingdings" w:hint="default"/>
+        <w:sz w:val="20"/>
+      </w:rPr>
+    </w:lvl>
+    <w:lvl w:ilvl="6" w:tentative="1">
+      <w:start w:val="1"/>
+      <w:numFmt w:val="bullet"/>
+      <w:lvlText w:val=""/>
+      <w:lvlJc w:val="left"/>
+      <w:pPr>
+        <w:tabs>
+          <w:tab w:val="num" w:pos="5040"/>
+        </w:tabs>
+        <w:ind w:left="5040" w:hanging="360"/>
+      </w:pPr>
+      <w:rPr>
+        <w:rFonts w:ascii="Wingdings" w:hAnsi="Wingdings" w:hint="default"/>
+        <w:sz w:val="20"/>
+      </w:rPr>
+    </w:lvl>
+    <w:lvl w:ilvl="7" w:tentative="1">
+      <w:start w:val="1"/>
+      <w:numFmt w:val="bullet"/>
+      <w:lvlText w:val=""/>
+      <w:lvlJc w:val="left"/>
+      <w:pPr>
+        <w:tabs>
+          <w:tab w:val="num" w:pos="5760"/>
+        </w:tabs>
+        <w:ind w:left="5760" w:hanging="360"/>
+      </w:pPr>
+      <w:rPr>
+        <w:rFonts w:ascii="Wingdings" w:hAnsi="Wingdings" w:hint="default"/>
+        <w:sz w:val="20"/>
+      </w:rPr>
+    </w:lvl>
+    <w:lvl w:ilvl="8" w:tentative="1">
+      <w:start w:val="1"/>
+      <w:numFmt w:val="bullet"/>
+      <w:lvlText w:val=""/>
+      <w:lvlJc w:val="left"/>
+      <w:pPr>
+        <w:tabs>
+          <w:tab w:val="num" w:pos="6480"/>
+        </w:tabs>
+        <w:ind w:left="6480" w:hanging="360"/>
+      </w:pPr>
+      <w:rPr>
+        <w:rFonts w:ascii="Wingdings" w:hAnsi="Wingdings" w:hint="default"/>
+        <w:sz w:val="20"/>
+      </w:rPr>
+    </w:lvl>
+  </w:abstractNum>
+  <w:abstractNum w:abstractNumId="20" w15:restartNumberingAfterBreak="0">
     <w:nsid w:val="49756273"/>
     <w:multiLevelType w:val="multilevel"/>
     <w:tmpl w:val="3606CC90"/>
@@ -6635,7 +8047,7 @@
       </w:rPr>
     </w:lvl>
   </w:abstractNum>
-  <w:abstractNum w:abstractNumId="16" w15:restartNumberingAfterBreak="0">
+  <w:abstractNum w:abstractNumId="21" w15:restartNumberingAfterBreak="0">
     <w:nsid w:val="521F3D51"/>
     <w:multiLevelType w:val="multilevel"/>
     <w:tmpl w:val="2396A222"/>
@@ -6784,7 +8196,156 @@
       </w:rPr>
     </w:lvl>
   </w:abstractNum>
-  <w:abstractNum w:abstractNumId="17" w15:restartNumberingAfterBreak="0">
+  <w:abstractNum w:abstractNumId="22" w15:restartNumberingAfterBreak="0">
+    <w:nsid w:val="556300C0"/>
+    <w:multiLevelType w:val="multilevel"/>
+    <w:tmpl w:val="09E4BD38"/>
+    <w:lvl w:ilvl="0">
+      <w:start w:val="1"/>
+      <w:numFmt w:val="bullet"/>
+      <w:lvlText w:val=""/>
+      <w:lvlJc w:val="left"/>
+      <w:pPr>
+        <w:tabs>
+          <w:tab w:val="num" w:pos="720"/>
+        </w:tabs>
+        <w:ind w:left="720" w:hanging="360"/>
+      </w:pPr>
+      <w:rPr>
+        <w:rFonts w:ascii="Symbol" w:hAnsi="Symbol" w:hint="default"/>
+        <w:sz w:val="20"/>
+      </w:rPr>
+    </w:lvl>
+    <w:lvl w:ilvl="1" w:tentative="1">
+      <w:start w:val="1"/>
+      <w:numFmt w:val="bullet"/>
+      <w:lvlText w:val="o"/>
+      <w:lvlJc w:val="left"/>
+      <w:pPr>
+        <w:tabs>
+          <w:tab w:val="num" w:pos="1440"/>
+        </w:tabs>
+        <w:ind w:left="1440" w:hanging="360"/>
+      </w:pPr>
+      <w:rPr>
+        <w:rFonts w:ascii="Courier New" w:hAnsi="Courier New" w:hint="default"/>
+        <w:sz w:val="20"/>
+      </w:rPr>
+    </w:lvl>
+    <w:lvl w:ilvl="2" w:tentative="1">
+      <w:start w:val="1"/>
+      <w:numFmt w:val="bullet"/>
+      <w:lvlText w:val=""/>
+      <w:lvlJc w:val="left"/>
+      <w:pPr>
+        <w:tabs>
+          <w:tab w:val="num" w:pos="2160"/>
+        </w:tabs>
+        <w:ind w:left="2160" w:hanging="360"/>
+      </w:pPr>
+      <w:rPr>
+        <w:rFonts w:ascii="Wingdings" w:hAnsi="Wingdings" w:hint="default"/>
+        <w:sz w:val="20"/>
+      </w:rPr>
+    </w:lvl>
+    <w:lvl w:ilvl="3" w:tentative="1">
+      <w:start w:val="1"/>
+      <w:numFmt w:val="bullet"/>
+      <w:lvlText w:val=""/>
+      <w:lvlJc w:val="left"/>
+      <w:pPr>
+        <w:tabs>
+          <w:tab w:val="num" w:pos="2880"/>
+        </w:tabs>
+        <w:ind w:left="2880" w:hanging="360"/>
+      </w:pPr>
+      <w:rPr>
+        <w:rFonts w:ascii="Wingdings" w:hAnsi="Wingdings" w:hint="default"/>
+        <w:sz w:val="20"/>
+      </w:rPr>
+    </w:lvl>
+    <w:lvl w:ilvl="4" w:tentative="1">
+      <w:start w:val="1"/>
+      <w:numFmt w:val="bullet"/>
+      <w:lvlText w:val=""/>
+      <w:lvlJc w:val="left"/>
+      <w:pPr>
+        <w:tabs>
+          <w:tab w:val="num" w:pos="3600"/>
+        </w:tabs>
+        <w:ind w:left="3600" w:hanging="360"/>
+      </w:pPr>
+      <w:rPr>
+        <w:rFonts w:ascii="Wingdings" w:hAnsi="Wingdings" w:hint="default"/>
+        <w:sz w:val="20"/>
+      </w:rPr>
+    </w:lvl>
+    <w:lvl w:ilvl="5" w:tentative="1">
+      <w:start w:val="1"/>
+      <w:numFmt w:val="bullet"/>
+      <w:lvlText w:val=""/>
+      <w:lvlJc w:val="left"/>
+      <w:pPr>
+        <w:tabs>
+          <w:tab w:val="num" w:pos="4320"/>
+        </w:tabs>
+        <w:ind w:left="4320" w:hanging="360"/>
+      </w:pPr>
+      <w:rPr>
+        <w:rFonts w:ascii="Wingdings" w:hAnsi="Wingdings" w:hint="default"/>
+        <w:sz w:val="20"/>
+      </w:rPr>
+    </w:lvl>
+    <w:lvl w:ilvl="6" w:tentative="1">
+      <w:start w:val="1"/>
+      <w:numFmt w:val="bullet"/>
+      <w:lvlText w:val=""/>
+      <w:lvlJc w:val="left"/>
+      <w:pPr>
+        <w:tabs>
+          <w:tab w:val="num" w:pos="5040"/>
+        </w:tabs>
+        <w:ind w:left="5040" w:hanging="360"/>
+      </w:pPr>
+      <w:rPr>
+        <w:rFonts w:ascii="Wingdings" w:hAnsi="Wingdings" w:hint="default"/>
+        <w:sz w:val="20"/>
+      </w:rPr>
+    </w:lvl>
+    <w:lvl w:ilvl="7" w:tentative="1">
+      <w:start w:val="1"/>
+      <w:numFmt w:val="bullet"/>
+      <w:lvlText w:val=""/>
+      <w:lvlJc w:val="left"/>
+      <w:pPr>
+        <w:tabs>
+          <w:tab w:val="num" w:pos="5760"/>
+        </w:tabs>
+        <w:ind w:left="5760" w:hanging="360"/>
+      </w:pPr>
+      <w:rPr>
+        <w:rFonts w:ascii="Wingdings" w:hAnsi="Wingdings" w:hint="default"/>
+        <w:sz w:val="20"/>
+      </w:rPr>
+    </w:lvl>
+    <w:lvl w:ilvl="8" w:tentative="1">
+      <w:start w:val="1"/>
+      <w:numFmt w:val="bullet"/>
+      <w:lvlText w:val=""/>
+      <w:lvlJc w:val="left"/>
+      <w:pPr>
+        <w:tabs>
+          <w:tab w:val="num" w:pos="6480"/>
+        </w:tabs>
+        <w:ind w:left="6480" w:hanging="360"/>
+      </w:pPr>
+      <w:rPr>
+        <w:rFonts w:ascii="Wingdings" w:hAnsi="Wingdings" w:hint="default"/>
+        <w:sz w:val="20"/>
+      </w:rPr>
+    </w:lvl>
+  </w:abstractNum>
+  <w:abstractNum w:abstractNumId="23" w15:restartNumberingAfterBreak="0">
     <w:nsid w:val="55A01D3B"/>
     <w:multiLevelType w:val="multilevel"/>
     <w:tmpl w:val="2E76E6C8"/>
@@ -6933,7 +8494,7 @@
       </w:rPr>
     </w:lvl>
   </w:abstractNum>
-  <w:abstractNum w:abstractNumId="18" w15:restartNumberingAfterBreak="0">
+  <w:abstractNum w:abstractNumId="24" w15:restartNumberingAfterBreak="0">
     <w:nsid w:val="5F3E05E8"/>
     <w:multiLevelType w:val="multilevel"/>
     <w:tmpl w:val="785C0738"/>
@@ -7082,7 +8643,7 @@
       </w:rPr>
     </w:lvl>
   </w:abstractNum>
-  <w:abstractNum w:abstractNumId="19" w15:restartNumberingAfterBreak="0">
+  <w:abstractNum w:abstractNumId="25" w15:restartNumberingAfterBreak="0">
     <w:nsid w:val="5F701357"/>
     <w:multiLevelType w:val="multilevel"/>
     <w:tmpl w:val="34864EB6"/>
@@ -7231,7 +8792,7 @@
       </w:rPr>
     </w:lvl>
   </w:abstractNum>
-  <w:abstractNum w:abstractNumId="20" w15:restartNumberingAfterBreak="0">
+  <w:abstractNum w:abstractNumId="26" w15:restartNumberingAfterBreak="0">
     <w:nsid w:val="605977DB"/>
     <w:multiLevelType w:val="multilevel"/>
     <w:tmpl w:val="DC8C9824"/>
@@ -7380,7 +8941,7 @@
       </w:rPr>
     </w:lvl>
   </w:abstractNum>
-  <w:abstractNum w:abstractNumId="21" w15:restartNumberingAfterBreak="0">
+  <w:abstractNum w:abstractNumId="27" w15:restartNumberingAfterBreak="0">
     <w:nsid w:val="60D051E3"/>
     <w:multiLevelType w:val="multilevel"/>
     <w:tmpl w:val="90E65830"/>
@@ -7529,7 +9090,7 @@
       </w:rPr>
     </w:lvl>
   </w:abstractNum>
-  <w:abstractNum w:abstractNumId="22" w15:restartNumberingAfterBreak="0">
+  <w:abstractNum w:abstractNumId="28" w15:restartNumberingAfterBreak="0">
     <w:nsid w:val="60DC17A6"/>
     <w:multiLevelType w:val="multilevel"/>
     <w:tmpl w:val="D9089D92"/>
@@ -7678,7 +9239,7 @@
       </w:rPr>
     </w:lvl>
   </w:abstractNum>
-  <w:abstractNum w:abstractNumId="23" w15:restartNumberingAfterBreak="0">
+  <w:abstractNum w:abstractNumId="29" w15:restartNumberingAfterBreak="0">
     <w:nsid w:val="66CC5D4E"/>
     <w:multiLevelType w:val="multilevel"/>
     <w:tmpl w:val="82E2BA6C"/>
@@ -7827,7 +9388,7 @@
       </w:rPr>
     </w:lvl>
   </w:abstractNum>
-  <w:abstractNum w:abstractNumId="24" w15:restartNumberingAfterBreak="0">
+  <w:abstractNum w:abstractNumId="30" w15:restartNumberingAfterBreak="0">
     <w:nsid w:val="6A8F4E28"/>
     <w:multiLevelType w:val="multilevel"/>
     <w:tmpl w:val="44A82BB6"/>
@@ -7976,7 +9537,120 @@
       </w:rPr>
     </w:lvl>
   </w:abstractNum>
-  <w:abstractNum w:abstractNumId="25" w15:restartNumberingAfterBreak="0">
+  <w:abstractNum w:abstractNumId="31" w15:restartNumberingAfterBreak="0">
+    <w:nsid w:val="6BAE4581"/>
+    <w:multiLevelType w:val="multilevel"/>
+    <w:tmpl w:val="4A0AE320"/>
+    <w:lvl w:ilvl="0">
+      <w:start w:val="1"/>
+      <w:numFmt w:val="decimal"/>
+      <w:lvlText w:val="%1."/>
+      <w:lvlJc w:val="left"/>
+      <w:pPr>
+        <w:tabs>
+          <w:tab w:val="num" w:pos="720"/>
+        </w:tabs>
+        <w:ind w:left="720" w:hanging="360"/>
+      </w:pPr>
+    </w:lvl>
+    <w:lvl w:ilvl="1" w:tentative="1">
+      <w:start w:val="1"/>
+      <w:numFmt w:val="decimal"/>
+      <w:lvlText w:val="%2."/>
+      <w:lvlJc w:val="left"/>
+      <w:pPr>
+        <w:tabs>
+          <w:tab w:val="num" w:pos="1440"/>
+        </w:tabs>
+        <w:ind w:left="1440" w:hanging="360"/>
+      </w:pPr>
+    </w:lvl>
+    <w:lvl w:ilvl="2" w:tentative="1">
+      <w:start w:val="1"/>
+      <w:numFmt w:val="decimal"/>
+      <w:lvlText w:val="%3."/>
+      <w:lvlJc w:val="left"/>
+      <w:pPr>
+        <w:tabs>
+          <w:tab w:val="num" w:pos="2160"/>
+        </w:tabs>
+        <w:ind w:left="2160" w:hanging="360"/>
+      </w:pPr>
+    </w:lvl>
+    <w:lvl w:ilvl="3" w:tentative="1">
+      <w:start w:val="1"/>
+      <w:numFmt w:val="decimal"/>
+      <w:lvlText w:val="%4."/>
+      <w:lvlJc w:val="left"/>
+      <w:pPr>
+        <w:tabs>
+          <w:tab w:val="num" w:pos="2880"/>
+        </w:tabs>
+        <w:ind w:left="2880" w:hanging="360"/>
+      </w:pPr>
+    </w:lvl>
+    <w:lvl w:ilvl="4" w:tentative="1">
+      <w:start w:val="1"/>
+      <w:numFmt w:val="decimal"/>
+      <w:lvlText w:val="%5."/>
+      <w:lvlJc w:val="left"/>
+      <w:pPr>
+        <w:tabs>
+          <w:tab w:val="num" w:pos="3600"/>
+        </w:tabs>
+        <w:ind w:left="3600" w:hanging="360"/>
+      </w:pPr>
+    </w:lvl>
+    <w:lvl w:ilvl="5" w:tentative="1">
+      <w:start w:val="1"/>
+      <w:numFmt w:val="decimal"/>
+      <w:lvlText w:val="%6."/>
+      <w:lvlJc w:val="left"/>
+      <w:pPr>
+        <w:tabs>
+          <w:tab w:val="num" w:pos="4320"/>
+        </w:tabs>
+        <w:ind w:left="4320" w:hanging="360"/>
+      </w:pPr>
+    </w:lvl>
+    <w:lvl w:ilvl="6" w:tentative="1">
+      <w:start w:val="1"/>
+      <w:numFmt w:val="decimal"/>
+      <w:lvlText w:val="%7."/>
+      <w:lvlJc w:val="left"/>
+      <w:pPr>
+        <w:tabs>
+          <w:tab w:val="num" w:pos="5040"/>
+        </w:tabs>
+        <w:ind w:left="5040" w:hanging="360"/>
+      </w:pPr>
+    </w:lvl>
+    <w:lvl w:ilvl="7" w:tentative="1">
+      <w:start w:val="1"/>
+      <w:numFmt w:val="decimal"/>
+      <w:lvlText w:val="%8."/>
+      <w:lvlJc w:val="left"/>
+      <w:pPr>
+        <w:tabs>
+          <w:tab w:val="num" w:pos="5760"/>
+        </w:tabs>
+        <w:ind w:left="5760" w:hanging="360"/>
+      </w:pPr>
+    </w:lvl>
+    <w:lvl w:ilvl="8" w:tentative="1">
+      <w:start w:val="1"/>
+      <w:numFmt w:val="decimal"/>
+      <w:lvlText w:val="%9."/>
+      <w:lvlJc w:val="left"/>
+      <w:pPr>
+        <w:tabs>
+          <w:tab w:val="num" w:pos="6480"/>
+        </w:tabs>
+        <w:ind w:left="6480" w:hanging="360"/>
+      </w:pPr>
+    </w:lvl>
+  </w:abstractNum>
+  <w:abstractNum w:abstractNumId="32" w15:restartNumberingAfterBreak="0">
     <w:nsid w:val="6DBD3B32"/>
     <w:multiLevelType w:val="multilevel"/>
     <w:tmpl w:val="54AE0552"/>
@@ -8125,7 +9799,7 @@
       </w:rPr>
     </w:lvl>
   </w:abstractNum>
-  <w:abstractNum w:abstractNumId="26" w15:restartNumberingAfterBreak="0">
+  <w:abstractNum w:abstractNumId="33" w15:restartNumberingAfterBreak="0">
     <w:nsid w:val="73C5309C"/>
     <w:multiLevelType w:val="multilevel"/>
     <w:tmpl w:val="0FAA4B28"/>
@@ -8274,7 +9948,7 @@
       </w:rPr>
     </w:lvl>
   </w:abstractNum>
-  <w:abstractNum w:abstractNumId="27" w15:restartNumberingAfterBreak="0">
+  <w:abstractNum w:abstractNumId="34" w15:restartNumberingAfterBreak="0">
     <w:nsid w:val="76805E4E"/>
     <w:multiLevelType w:val="multilevel"/>
     <w:tmpl w:val="2FE01BDC"/>
@@ -8423,7 +10097,7 @@
       </w:rPr>
     </w:lvl>
   </w:abstractNum>
-  <w:abstractNum w:abstractNumId="28" w15:restartNumberingAfterBreak="0">
+  <w:abstractNum w:abstractNumId="35" w15:restartNumberingAfterBreak="0">
     <w:nsid w:val="7DD10657"/>
     <w:multiLevelType w:val="multilevel"/>
     <w:tmpl w:val="B6C05714"/>
@@ -8572,7 +10246,7 @@
       </w:rPr>
     </w:lvl>
   </w:abstractNum>
-  <w:abstractNum w:abstractNumId="29" w15:restartNumberingAfterBreak="0">
+  <w:abstractNum w:abstractNumId="36" w15:restartNumberingAfterBreak="0">
     <w:nsid w:val="7F8C696B"/>
     <w:multiLevelType w:val="multilevel"/>
     <w:tmpl w:val="1AFA319E"/>
@@ -8722,94 +10396,115 @@
     </w:lvl>
   </w:abstractNum>
   <w:num w:numId="1" w16cid:durableId="82340597">
+    <w:abstractNumId w:val="26"/>
+  </w:num>
+  <w:num w:numId="2" w16cid:durableId="540897718">
+    <w:abstractNumId w:val="1"/>
+  </w:num>
+  <w:num w:numId="3" w16cid:durableId="1495610415">
+    <w:abstractNumId w:val="6"/>
+  </w:num>
+  <w:num w:numId="4" w16cid:durableId="115762030">
+    <w:abstractNumId w:val="10"/>
+  </w:num>
+  <w:num w:numId="5" w16cid:durableId="2058894298">
+    <w:abstractNumId w:val="14"/>
+  </w:num>
+  <w:num w:numId="6" w16cid:durableId="2019576816">
+    <w:abstractNumId w:val="25"/>
+  </w:num>
+  <w:num w:numId="7" w16cid:durableId="715811104">
+    <w:abstractNumId w:val="32"/>
+  </w:num>
+  <w:num w:numId="8" w16cid:durableId="2092241152">
+    <w:abstractNumId w:val="12"/>
+  </w:num>
+  <w:num w:numId="9" w16cid:durableId="414784536">
+    <w:abstractNumId w:val="24"/>
+  </w:num>
+  <w:num w:numId="10" w16cid:durableId="1255743513">
+    <w:abstractNumId w:val="33"/>
+  </w:num>
+  <w:num w:numId="11" w16cid:durableId="1152213554">
+    <w:abstractNumId w:val="7"/>
+  </w:num>
+  <w:num w:numId="12" w16cid:durableId="647049323">
+    <w:abstractNumId w:val="34"/>
+  </w:num>
+  <w:num w:numId="13" w16cid:durableId="1876891265">
+    <w:abstractNumId w:val="5"/>
+  </w:num>
+  <w:num w:numId="14" w16cid:durableId="1993098974">
+    <w:abstractNumId w:val="36"/>
+  </w:num>
+  <w:num w:numId="15" w16cid:durableId="144859561">
+    <w:abstractNumId w:val="3"/>
+  </w:num>
+  <w:num w:numId="16" w16cid:durableId="1245609003">
+    <w:abstractNumId w:val="28"/>
+  </w:num>
+  <w:num w:numId="17" w16cid:durableId="1358580201">
+    <w:abstractNumId w:val="16"/>
+  </w:num>
+  <w:num w:numId="18" w16cid:durableId="50617028">
+    <w:abstractNumId w:val="15"/>
+  </w:num>
+  <w:num w:numId="19" w16cid:durableId="521556386">
+    <w:abstractNumId w:val="29"/>
+  </w:num>
+  <w:num w:numId="20" w16cid:durableId="1936791600">
+    <w:abstractNumId w:val="2"/>
+  </w:num>
+  <w:num w:numId="21" w16cid:durableId="465438878">
+    <w:abstractNumId w:val="9"/>
+  </w:num>
+  <w:num w:numId="22" w16cid:durableId="1620070291">
+    <w:abstractNumId w:val="11"/>
+  </w:num>
+  <w:num w:numId="23" w16cid:durableId="124273613">
+    <w:abstractNumId w:val="35"/>
+  </w:num>
+  <w:num w:numId="24" w16cid:durableId="344988005">
+    <w:abstractNumId w:val="23"/>
+  </w:num>
+  <w:num w:numId="25" w16cid:durableId="627131921">
+    <w:abstractNumId w:val="30"/>
+  </w:num>
+  <w:num w:numId="26" w16cid:durableId="623968758">
     <w:abstractNumId w:val="20"/>
   </w:num>
-  <w:num w:numId="2" w16cid:durableId="540897718">
-    <w:abstractNumId w:val="0"/>
+  <w:num w:numId="27" w16cid:durableId="1206915007">
+    <w:abstractNumId w:val="27"/>
   </w:num>
-  <w:num w:numId="3" w16cid:durableId="1495610415">
+  <w:num w:numId="28" w16cid:durableId="746457036">
+    <w:abstractNumId w:val="13"/>
+  </w:num>
+  <w:num w:numId="29" w16cid:durableId="1039936778">
+    <w:abstractNumId w:val="21"/>
+  </w:num>
+  <w:num w:numId="30" w16cid:durableId="1682777559">
+    <w:abstractNumId w:val="8"/>
+  </w:num>
+  <w:num w:numId="31" w16cid:durableId="1059129407">
+    <w:abstractNumId w:val="18"/>
+  </w:num>
+  <w:num w:numId="32" w16cid:durableId="1710035841">
     <w:abstractNumId w:val="4"/>
   </w:num>
-  <w:num w:numId="4" w16cid:durableId="115762030">
-    <w:abstractNumId w:val="8"/>
+  <w:num w:numId="33" w16cid:durableId="2005088687">
+    <w:abstractNumId w:val="31"/>
   </w:num>
-  <w:num w:numId="5" w16cid:durableId="2058894298">
-    <w:abstractNumId w:val="12"/>
+  <w:num w:numId="34" w16cid:durableId="805319320">
+    <w:abstractNumId w:val="17"/>
   </w:num>
-  <w:num w:numId="6" w16cid:durableId="2019576816">
+  <w:num w:numId="35" w16cid:durableId="1963268215">
     <w:abstractNumId w:val="19"/>
   </w:num>
-  <w:num w:numId="7" w16cid:durableId="715811104">
-    <w:abstractNumId w:val="25"/>
-  </w:num>
-  <w:num w:numId="8" w16cid:durableId="2092241152">
-    <w:abstractNumId w:val="10"/>
-  </w:num>
-  <w:num w:numId="9" w16cid:durableId="414784536">
-    <w:abstractNumId w:val="18"/>
-  </w:num>
-  <w:num w:numId="10" w16cid:durableId="1255743513">
-    <w:abstractNumId w:val="26"/>
-  </w:num>
-  <w:num w:numId="11" w16cid:durableId="1152213554">
-    <w:abstractNumId w:val="5"/>
-  </w:num>
-  <w:num w:numId="12" w16cid:durableId="647049323">
-    <w:abstractNumId w:val="27"/>
-  </w:num>
-  <w:num w:numId="13" w16cid:durableId="1876891265">
-    <w:abstractNumId w:val="3"/>
-  </w:num>
-  <w:num w:numId="14" w16cid:durableId="1993098974">
-    <w:abstractNumId w:val="29"/>
-  </w:num>
-  <w:num w:numId="15" w16cid:durableId="144859561">
-    <w:abstractNumId w:val="2"/>
-  </w:num>
-  <w:num w:numId="16" w16cid:durableId="1245609003">
+  <w:num w:numId="36" w16cid:durableId="1662466585">
     <w:abstractNumId w:val="22"/>
   </w:num>
-  <w:num w:numId="17" w16cid:durableId="1358580201">
-    <w:abstractNumId w:val="14"/>
-  </w:num>
-  <w:num w:numId="18" w16cid:durableId="50617028">
-    <w:abstractNumId w:val="13"/>
-  </w:num>
-  <w:num w:numId="19" w16cid:durableId="521556386">
-    <w:abstractNumId w:val="23"/>
-  </w:num>
-  <w:num w:numId="20" w16cid:durableId="1936791600">
-    <w:abstractNumId w:val="1"/>
-  </w:num>
-  <w:num w:numId="21" w16cid:durableId="465438878">
-    <w:abstractNumId w:val="7"/>
-  </w:num>
-  <w:num w:numId="22" w16cid:durableId="1620070291">
-    <w:abstractNumId w:val="9"/>
-  </w:num>
-  <w:num w:numId="23" w16cid:durableId="124273613">
-    <w:abstractNumId w:val="28"/>
-  </w:num>
-  <w:num w:numId="24" w16cid:durableId="344988005">
-    <w:abstractNumId w:val="17"/>
-  </w:num>
-  <w:num w:numId="25" w16cid:durableId="627131921">
-    <w:abstractNumId w:val="24"/>
-  </w:num>
-  <w:num w:numId="26" w16cid:durableId="623968758">
-    <w:abstractNumId w:val="15"/>
-  </w:num>
-  <w:num w:numId="27" w16cid:durableId="1206915007">
-    <w:abstractNumId w:val="21"/>
-  </w:num>
-  <w:num w:numId="28" w16cid:durableId="746457036">
-    <w:abstractNumId w:val="11"/>
-  </w:num>
-  <w:num w:numId="29" w16cid:durableId="1039936778">
-    <w:abstractNumId w:val="16"/>
-  </w:num>
-  <w:num w:numId="30" w16cid:durableId="1682777559">
-    <w:abstractNumId w:val="6"/>
+  <w:num w:numId="37" w16cid:durableId="957569991">
+    <w:abstractNumId w:val="0"/>
   </w:num>
 </w:numbering>
 </file>

</xml_diff>